<commit_message>
Contenido de la guía de usuario
</commit_message>
<xml_diff>
--- a/Guia de Usuario Predictive Modelling App.docx
+++ b/Guia de Usuario Predictive Modelling App.docx
@@ -2,6 +2,2137 @@
 <file path=word/document.xml><?xml version="1.0" encoding="utf-8"?>
 <w:document xmlns:wpc="http://schemas.microsoft.com/office/word/2010/wordprocessingCanvas" xmlns:cx="http://schemas.microsoft.com/office/drawing/2014/chartex" xmlns:cx1="http://schemas.microsoft.com/office/drawing/2015/9/8/chartex" xmlns:cx2="http://schemas.microsoft.com/office/drawing/2015/10/21/chartex" xmlns:cx3="http://schemas.microsoft.com/office/drawing/2016/5/9/chartex" xmlns:cx4="http://schemas.microsoft.com/office/drawing/2016/5/10/chartex" xmlns:cx5="http://schemas.microsoft.com/office/drawing/2016/5/11/chartex" xmlns:cx6="http://schemas.microsoft.com/office/drawing/2016/5/12/chartex" xmlns:cx7="http://schemas.microsoft.com/office/drawing/2016/5/13/chartex" xmlns:cx8="http://schemas.microsoft.com/office/drawing/2016/5/14/chartex" xmlns:mc="http://schemas.openxmlformats.org/markup-compatibility/2006" xmlns:aink="http://schemas.microsoft.com/office/drawing/2016/ink" xmlns:am3d="http://schemas.microsoft.com/office/drawing/2017/model3d" xmlns:o="urn:schemas-microsoft-com:office:office" xmlns:oel="http://schemas.microsoft.com/office/2019/extlst" xmlns:r="http://schemas.openxmlformats.org/officeDocument/2006/relationships" xmlns:m="http://schemas.openxmlformats.org/officeDocument/2006/math" xmlns:v="urn:schemas-microsoft-com:vml" xmlns:wp14="http://schemas.microsoft.com/office/word/2010/wordprocessingDrawing" xmlns:wp="http://schemas.openxmlformats.org/drawingml/2006/wordprocessingDrawing" xmlns:w10="urn:schemas-microsoft-com:office:word" xmlns:w="http://schemas.openxmlformats.org/wordprocessingml/2006/main" xmlns:w14="http://schemas.microsoft.com/office/word/2010/wordml" xmlns:w15="http://schemas.microsoft.com/office/word/2012/wordml" xmlns:w16cex="http://schemas.microsoft.com/office/word/2018/wordml/cex" xmlns:w16cid="http://schemas.microsoft.com/office/word/2016/wordml/cid" xmlns:w16="http://schemas.microsoft.com/office/word/2018/wordml" xmlns:w16du="http://schemas.microsoft.com/office/word/2023/wordml/word16du" xmlns:w16sdtdh="http://schemas.microsoft.com/office/word/2020/wordml/sdtdatahash" xmlns:w16sdtfl="http://schemas.microsoft.com/office/word/2024/wordml/sdtformatlock" xmlns:w16se="http://schemas.microsoft.com/office/word/2015/wordml/symex" xmlns:wpg="http://schemas.microsoft.com/office/word/2010/wordprocessingGroup" xmlns:wpi="http://schemas.microsoft.com/office/word/2010/wordprocessingInk" xmlns:wne="http://schemas.microsoft.com/office/word/2006/wordml" xmlns:wps="http://schemas.microsoft.com/office/word/2010/wordprocessingShape" mc:Ignorable="w14 w15 w16se w16cid w16 w16cex w16sdtdh w16sdtfl w16du wp14">
   <w:body>
+    <w:p>
+      <w:pPr>
+        <w:jc w:val="center"/>
+        <w:rPr>
+          <w:rFonts w:ascii="WPP" w:hAnsi="WPP"/>
+          <w:b/>
+          <w:bCs/>
+          <w:sz w:val="28"/>
+          <w:szCs w:val="28"/>
+        </w:rPr>
+      </w:pPr>
+      <w:proofErr w:type="gramStart"/>
+      <w:r>
+        <w:rPr>
+          <w:rFonts w:ascii="WPP" w:hAnsi="WPP"/>
+          <w:b/>
+          <w:bCs/>
+          <w:sz w:val="28"/>
+          <w:szCs w:val="28"/>
+        </w:rPr>
+        <w:t xml:space="preserve">Predictive  </w:t>
+      </w:r>
+      <w:proofErr w:type="spellStart"/>
+      <w:r>
+        <w:rPr>
+          <w:rFonts w:ascii="WPP" w:hAnsi="WPP"/>
+          <w:b/>
+          <w:bCs/>
+          <w:sz w:val="28"/>
+          <w:szCs w:val="28"/>
+        </w:rPr>
+        <w:t>Modelling</w:t>
+      </w:r>
+      <w:proofErr w:type="spellEnd"/>
+      <w:proofErr w:type="gramEnd"/>
+      <w:r>
+        <w:rPr>
+          <w:rFonts w:ascii="WPP" w:hAnsi="WPP"/>
+          <w:b/>
+          <w:bCs/>
+          <w:sz w:val="28"/>
+          <w:szCs w:val="28"/>
+        </w:rPr>
+        <w:t xml:space="preserve"> App</w:t>
+      </w:r>
+    </w:p>
+    <w:p>
+      <w:pPr>
+        <w:rPr>
+          <w:rFonts w:ascii="WPP" w:hAnsi="WPP"/>
+          <w:b/>
+          <w:bCs/>
+          <w:sz w:val="26"/>
+          <w:szCs w:val="26"/>
+        </w:rPr>
+      </w:pPr>
+      <w:r>
+        <w:rPr>
+          <w:rFonts w:ascii="WPP" w:hAnsi="WPP"/>
+          <w:b/>
+          <w:bCs/>
+          <w:sz w:val="26"/>
+          <w:szCs w:val="26"/>
+        </w:rPr>
+        <w:t xml:space="preserve">Qué es Predictive </w:t>
+      </w:r>
+      <w:proofErr w:type="spellStart"/>
+      <w:r>
+        <w:rPr>
+          <w:rFonts w:ascii="WPP" w:hAnsi="WPP"/>
+          <w:b/>
+          <w:bCs/>
+          <w:sz w:val="26"/>
+          <w:szCs w:val="26"/>
+        </w:rPr>
+        <w:t>Modeling</w:t>
+      </w:r>
+      <w:proofErr w:type="spellEnd"/>
+    </w:p>
+    <w:p>
+      <w:pPr>
+        <w:rPr>
+          <w:rFonts w:ascii="WPP" w:hAnsi="WPP"/>
+        </w:rPr>
+      </w:pPr>
+      <w:r>
+        <w:rPr>
+          <w:rFonts w:ascii="WPP" w:hAnsi="WPP"/>
+        </w:rPr>
+        <w:t xml:space="preserve">Predictive </w:t>
+      </w:r>
+      <w:proofErr w:type="spellStart"/>
+      <w:r>
+        <w:rPr>
+          <w:rFonts w:ascii="WPP" w:hAnsi="WPP"/>
+        </w:rPr>
+        <w:t>Modelling</w:t>
+      </w:r>
+      <w:proofErr w:type="spellEnd"/>
+      <w:r>
+        <w:rPr>
+          <w:rFonts w:ascii="WPP" w:hAnsi="WPP"/>
+        </w:rPr>
+        <w:t xml:space="preserve"> es la solución de WPP que permite medir el impacto de una Campaña a los </w:t>
+      </w:r>
+      <w:proofErr w:type="spellStart"/>
+      <w:r>
+        <w:rPr>
+          <w:rFonts w:ascii="WPP" w:hAnsi="WPP"/>
+        </w:rPr>
+        <w:t>KPIs</w:t>
+      </w:r>
+      <w:proofErr w:type="spellEnd"/>
+      <w:r>
+        <w:rPr>
+          <w:rFonts w:ascii="WPP" w:hAnsi="WPP"/>
+        </w:rPr>
+        <w:t xml:space="preserve"> de Marketing o Negocio considerando información propia y de la competencia. </w:t>
+      </w:r>
+    </w:p>
+    <w:p>
+      <w:pPr>
+        <w:rPr>
+          <w:rFonts w:ascii="WPP" w:hAnsi="WPP"/>
+          <w:b/>
+          <w:bCs/>
+          <w:sz w:val="26"/>
+          <w:szCs w:val="26"/>
+        </w:rPr>
+      </w:pPr>
+      <w:r>
+        <w:rPr>
+          <w:rFonts w:ascii="WPP" w:hAnsi="WPP"/>
+          <w:b/>
+          <w:bCs/>
+          <w:sz w:val="26"/>
+          <w:szCs w:val="26"/>
+        </w:rPr>
+        <w:t>Fuentes de información</w:t>
+      </w:r>
+    </w:p>
+    <w:p>
+      <w:pPr>
+        <w:rPr>
+          <w:rFonts w:ascii="WPP" w:hAnsi="WPP"/>
+        </w:rPr>
+      </w:pPr>
+      <w:r>
+        <w:rPr>
+          <w:rFonts w:ascii="WPP" w:hAnsi="WPP"/>
+        </w:rPr>
+        <w:t xml:space="preserve">La fuente principal de esto es información sindicada, es decir, información de Inversión en </w:t>
+      </w:r>
+      <w:proofErr w:type="spellStart"/>
+      <w:r>
+        <w:rPr>
+          <w:rFonts w:ascii="WPP" w:hAnsi="WPP"/>
+        </w:rPr>
+        <w:t>Paid</w:t>
+      </w:r>
+      <w:proofErr w:type="spellEnd"/>
+      <w:r>
+        <w:rPr>
+          <w:rFonts w:ascii="WPP" w:hAnsi="WPP"/>
+        </w:rPr>
+        <w:t xml:space="preserve"> Media proviene de HR, </w:t>
+      </w:r>
+      <w:proofErr w:type="spellStart"/>
+      <w:r>
+        <w:rPr>
+          <w:rFonts w:ascii="WPP" w:hAnsi="WPP"/>
+        </w:rPr>
+        <w:t>Auditsa</w:t>
+      </w:r>
+      <w:proofErr w:type="spellEnd"/>
+      <w:r>
+        <w:rPr>
+          <w:rFonts w:ascii="WPP" w:hAnsi="WPP"/>
+        </w:rPr>
+        <w:t xml:space="preserve">, </w:t>
+      </w:r>
+      <w:proofErr w:type="spellStart"/>
+      <w:r>
+        <w:rPr>
+          <w:rFonts w:ascii="WPP" w:hAnsi="WPP"/>
+        </w:rPr>
+        <w:t>Admetricks</w:t>
+      </w:r>
+      <w:proofErr w:type="spellEnd"/>
+      <w:r>
+        <w:rPr>
+          <w:rFonts w:ascii="WPP" w:hAnsi="WPP"/>
+        </w:rPr>
+        <w:t xml:space="preserve"> y TMS </w:t>
+      </w:r>
+      <w:proofErr w:type="spellStart"/>
+      <w:r>
+        <w:rPr>
+          <w:rFonts w:ascii="WPP" w:hAnsi="WPP"/>
+        </w:rPr>
+        <w:t>Advance</w:t>
+      </w:r>
+      <w:proofErr w:type="spellEnd"/>
+      <w:r>
+        <w:rPr>
+          <w:rFonts w:ascii="WPP" w:hAnsi="WPP"/>
+        </w:rPr>
+        <w:t xml:space="preserve"> </w:t>
+      </w:r>
+    </w:p>
+    <w:p>
+      <w:pPr>
+        <w:rPr>
+          <w:rFonts w:ascii="WPP" w:hAnsi="WPP"/>
+        </w:rPr>
+      </w:pPr>
+      <w:r>
+        <w:rPr>
+          <w:rFonts w:ascii="WPP" w:hAnsi="WPP"/>
+        </w:rPr>
+        <w:t>Sobre los KPIS que se pueden trabajar son:</w:t>
+      </w:r>
+    </w:p>
+    <w:p>
+      <w:pPr>
+        <w:pStyle w:val="Prrafodelista"/>
+        <w:numPr>
+          <w:ilvl w:val="0"/>
+          <w:numId w:val="1"/>
+        </w:numPr>
+        <w:rPr>
+          <w:rFonts w:ascii="WPP" w:hAnsi="WPP"/>
+        </w:rPr>
+      </w:pPr>
+      <w:r>
+        <w:rPr>
+          <w:rFonts w:ascii="WPP" w:hAnsi="WPP"/>
+        </w:rPr>
+        <w:t xml:space="preserve">Ventas. Fuente WPP: Kantar / Nielsen o </w:t>
+      </w:r>
+      <w:proofErr w:type="spellStart"/>
+      <w:r>
+        <w:rPr>
+          <w:rFonts w:ascii="WPP" w:hAnsi="WPP"/>
+        </w:rPr>
+        <w:t>Euromonitor</w:t>
+      </w:r>
+      <w:proofErr w:type="spellEnd"/>
+      <w:r>
+        <w:rPr>
+          <w:rFonts w:ascii="WPP" w:hAnsi="WPP"/>
+        </w:rPr>
+        <w:t>. Se recomienda volumen</w:t>
+      </w:r>
+    </w:p>
+    <w:p>
+      <w:pPr>
+        <w:pStyle w:val="Prrafodelista"/>
+        <w:numPr>
+          <w:ilvl w:val="0"/>
+          <w:numId w:val="1"/>
+        </w:numPr>
+        <w:rPr>
+          <w:rFonts w:ascii="WPP" w:hAnsi="WPP"/>
+          <w:lang w:val="en-US"/>
+        </w:rPr>
+      </w:pPr>
+      <w:r>
+        <w:rPr>
+          <w:rFonts w:ascii="WPP" w:hAnsi="WPP"/>
+          <w:lang w:val="en-US"/>
+        </w:rPr>
+        <w:t xml:space="preserve">Brand Health. </w:t>
+      </w:r>
+      <w:r>
+        <w:rPr>
+          <w:rFonts w:ascii="WPP" w:hAnsi="WPP"/>
+          <w:lang w:val="en-US"/>
+        </w:rPr>
+        <w:t>Fuente WPP: YouGov o BAV</w:t>
+      </w:r>
+    </w:p>
+    <w:p>
+      <w:pPr>
+        <w:pStyle w:val="Prrafodelista"/>
+        <w:numPr>
+          <w:ilvl w:val="0"/>
+          <w:numId w:val="1"/>
+        </w:numPr>
+        <w:rPr>
+          <w:rFonts w:ascii="WPP" w:hAnsi="WPP"/>
+          <w:lang w:val="en-US"/>
+        </w:rPr>
+      </w:pPr>
+      <w:r>
+        <w:rPr>
+          <w:rFonts w:ascii="WPP" w:hAnsi="WPP"/>
+        </w:rPr>
+        <w:t xml:space="preserve">Visitas al sitio Web / Penetración. </w:t>
+      </w:r>
+      <w:r>
+        <w:rPr>
+          <w:rFonts w:ascii="WPP" w:hAnsi="WPP"/>
+          <w:lang w:val="en-US"/>
+        </w:rPr>
+        <w:t>Fuente WPP: Similar Web</w:t>
+      </w:r>
+    </w:p>
+    <w:p>
+      <w:pPr>
+        <w:pStyle w:val="Prrafodelista"/>
+        <w:numPr>
+          <w:ilvl w:val="0"/>
+          <w:numId w:val="1"/>
+        </w:numPr>
+        <w:rPr>
+          <w:rFonts w:ascii="WPP" w:hAnsi="WPP"/>
+        </w:rPr>
+      </w:pPr>
+      <w:r>
+        <w:rPr>
+          <w:rFonts w:ascii="WPP" w:hAnsi="WPP"/>
+        </w:rPr>
+        <w:t xml:space="preserve">Social Media: Métricas RRSS, </w:t>
+      </w:r>
+      <w:proofErr w:type="spellStart"/>
+      <w:r>
+        <w:rPr>
+          <w:rFonts w:ascii="WPP" w:hAnsi="WPP"/>
+        </w:rPr>
+        <w:t>Shareablee</w:t>
+      </w:r>
+      <w:proofErr w:type="spellEnd"/>
+      <w:r>
+        <w:rPr>
+          <w:rFonts w:ascii="WPP" w:hAnsi="WPP"/>
+        </w:rPr>
+        <w:t xml:space="preserve"> u </w:t>
+      </w:r>
+      <w:proofErr w:type="spellStart"/>
+      <w:r>
+        <w:rPr>
+          <w:rFonts w:ascii="WPP" w:hAnsi="WPP"/>
+        </w:rPr>
+        <w:t>Onclusive</w:t>
+      </w:r>
+      <w:proofErr w:type="spellEnd"/>
+    </w:p>
+    <w:p>
+      <w:pPr>
+        <w:rPr>
+          <w:rFonts w:ascii="WPP" w:hAnsi="WPP"/>
+        </w:rPr>
+      </w:pPr>
+      <w:r>
+        <w:rPr>
+          <w:rFonts w:ascii="WPP" w:hAnsi="WPP"/>
+        </w:rPr>
+        <w:t>Para cada una de las opciones, la información puede ser proporcionada por cliente o por WPP.</w:t>
+      </w:r>
+    </w:p>
+    <w:p>
+      <w:pPr>
+        <w:rPr>
+          <w:rFonts w:ascii="WPP" w:hAnsi="WPP"/>
+          <w:b/>
+          <w:bCs/>
+          <w:sz w:val="26"/>
+          <w:szCs w:val="26"/>
+        </w:rPr>
+      </w:pPr>
+      <w:r>
+        <w:rPr>
+          <w:rFonts w:ascii="WPP" w:hAnsi="WPP"/>
+          <w:b/>
+          <w:bCs/>
+          <w:sz w:val="26"/>
+          <w:szCs w:val="26"/>
+        </w:rPr>
+        <w:t>Temporalidad y granularidad:</w:t>
+      </w:r>
+    </w:p>
+    <w:tbl>
+      <w:tblPr>
+        <w:tblStyle w:val="Tablaconcuadrcula"/>
+        <w:tblW w:w="0" w:type="auto"/>
+        <w:tblLook w:val="04A0" w:firstRow="1" w:lastRow="0" w:firstColumn="1" w:lastColumn="0" w:noHBand="0" w:noVBand="1"/>
+      </w:tblPr>
+      <w:tblGrid>
+        <w:gridCol w:w="4414"/>
+        <w:gridCol w:w="4414"/>
+      </w:tblGrid>
+      <w:tr>
+        <w:tc>
+          <w:tcPr>
+            <w:tcW w:w="4414" w:type="dxa"/>
+            <w:shd w:val="clear" w:color="auto" w:fill="000000" w:themeFill="text1"/>
+          </w:tcPr>
+          <w:p>
+            <w:pPr>
+              <w:jc w:val="center"/>
+              <w:rPr>
+                <w:rFonts w:ascii="WPP" w:hAnsi="WPP"/>
+                <w:color w:val="FFFFFF" w:themeColor="background1"/>
+              </w:rPr>
+            </w:pPr>
+            <w:r>
+              <w:rPr>
+                <w:rFonts w:ascii="WPP" w:hAnsi="WPP"/>
+                <w:color w:val="FFFFFF" w:themeColor="background1"/>
+              </w:rPr>
+              <w:t>Granularidad</w:t>
+            </w:r>
+          </w:p>
+        </w:tc>
+        <w:tc>
+          <w:tcPr>
+            <w:tcW w:w="4414" w:type="dxa"/>
+            <w:shd w:val="clear" w:color="auto" w:fill="000000" w:themeFill="text1"/>
+          </w:tcPr>
+          <w:p>
+            <w:pPr>
+              <w:jc w:val="center"/>
+              <w:rPr>
+                <w:rFonts w:ascii="WPP" w:hAnsi="WPP"/>
+                <w:color w:val="FFFFFF" w:themeColor="background1"/>
+              </w:rPr>
+            </w:pPr>
+            <w:r>
+              <w:rPr>
+                <w:rFonts w:ascii="WPP" w:hAnsi="WPP"/>
+                <w:color w:val="FFFFFF" w:themeColor="background1"/>
+              </w:rPr>
+              <w:t>Periodicidad mínima (# de años)</w:t>
+            </w:r>
+          </w:p>
+        </w:tc>
+      </w:tr>
+      <w:tr>
+        <w:tc>
+          <w:tcPr>
+            <w:tcW w:w="4414" w:type="dxa"/>
+          </w:tcPr>
+          <w:p>
+            <w:pPr>
+              <w:jc w:val="center"/>
+              <w:rPr>
+                <w:rFonts w:ascii="WPP" w:hAnsi="WPP"/>
+              </w:rPr>
+            </w:pPr>
+            <w:r>
+              <w:rPr>
+                <w:rFonts w:ascii="WPP" w:hAnsi="WPP"/>
+              </w:rPr>
+              <w:t>Semanal</w:t>
+            </w:r>
+          </w:p>
+        </w:tc>
+        <w:tc>
+          <w:tcPr>
+            <w:tcW w:w="4414" w:type="dxa"/>
+          </w:tcPr>
+          <w:p>
+            <w:pPr>
+              <w:jc w:val="center"/>
+              <w:rPr>
+                <w:rFonts w:ascii="WPP" w:hAnsi="WPP"/>
+              </w:rPr>
+            </w:pPr>
+            <w:r>
+              <w:rPr>
+                <w:rFonts w:ascii="WPP" w:hAnsi="WPP"/>
+              </w:rPr>
+              <w:t>1</w:t>
+            </w:r>
+          </w:p>
+        </w:tc>
+      </w:tr>
+      <w:tr>
+        <w:tc>
+          <w:tcPr>
+            <w:tcW w:w="4414" w:type="dxa"/>
+          </w:tcPr>
+          <w:p>
+            <w:pPr>
+              <w:jc w:val="center"/>
+              <w:rPr>
+                <w:rFonts w:ascii="WPP" w:hAnsi="WPP"/>
+              </w:rPr>
+            </w:pPr>
+            <w:r>
+              <w:rPr>
+                <w:rFonts w:ascii="WPP" w:hAnsi="WPP"/>
+              </w:rPr>
+              <w:t>Mensual</w:t>
+            </w:r>
+          </w:p>
+        </w:tc>
+        <w:tc>
+          <w:tcPr>
+            <w:tcW w:w="4414" w:type="dxa"/>
+          </w:tcPr>
+          <w:p>
+            <w:pPr>
+              <w:jc w:val="center"/>
+              <w:rPr>
+                <w:rFonts w:ascii="WPP" w:hAnsi="WPP"/>
+              </w:rPr>
+            </w:pPr>
+            <w:r>
+              <w:rPr>
+                <w:rFonts w:ascii="WPP" w:hAnsi="WPP"/>
+              </w:rPr>
+              <w:t>3</w:t>
+            </w:r>
+          </w:p>
+        </w:tc>
+      </w:tr>
+      <w:tr>
+        <w:tc>
+          <w:tcPr>
+            <w:tcW w:w="4414" w:type="dxa"/>
+          </w:tcPr>
+          <w:p>
+            <w:pPr>
+              <w:jc w:val="center"/>
+              <w:rPr>
+                <w:rFonts w:ascii="WPP" w:hAnsi="WPP"/>
+              </w:rPr>
+            </w:pPr>
+            <w:r>
+              <w:rPr>
+                <w:rFonts w:ascii="WPP" w:hAnsi="WPP"/>
+              </w:rPr>
+              <w:t>Trimestral</w:t>
+            </w:r>
+          </w:p>
+        </w:tc>
+        <w:tc>
+          <w:tcPr>
+            <w:tcW w:w="4414" w:type="dxa"/>
+          </w:tcPr>
+          <w:p>
+            <w:pPr>
+              <w:jc w:val="center"/>
+              <w:rPr>
+                <w:rFonts w:ascii="WPP" w:hAnsi="WPP"/>
+              </w:rPr>
+            </w:pPr>
+            <w:r>
+              <w:rPr>
+                <w:rFonts w:ascii="WPP" w:hAnsi="WPP"/>
+              </w:rPr>
+              <w:t>5</w:t>
+            </w:r>
+          </w:p>
+        </w:tc>
+      </w:tr>
+      <w:tr>
+        <w:tc>
+          <w:tcPr>
+            <w:tcW w:w="4414" w:type="dxa"/>
+          </w:tcPr>
+          <w:p>
+            <w:pPr>
+              <w:jc w:val="center"/>
+              <w:rPr>
+                <w:rFonts w:ascii="WPP" w:hAnsi="WPP"/>
+              </w:rPr>
+            </w:pPr>
+            <w:r>
+              <w:rPr>
+                <w:rFonts w:ascii="WPP" w:hAnsi="WPP"/>
+              </w:rPr>
+              <w:t>Anual</w:t>
+            </w:r>
+          </w:p>
+        </w:tc>
+        <w:tc>
+          <w:tcPr>
+            <w:tcW w:w="4414" w:type="dxa"/>
+          </w:tcPr>
+          <w:p>
+            <w:pPr>
+              <w:jc w:val="center"/>
+              <w:rPr>
+                <w:rFonts w:ascii="WPP" w:hAnsi="WPP"/>
+              </w:rPr>
+            </w:pPr>
+            <w:r>
+              <w:rPr>
+                <w:rFonts w:ascii="WPP" w:hAnsi="WPP"/>
+              </w:rPr>
+              <w:t>7</w:t>
+            </w:r>
+          </w:p>
+        </w:tc>
+      </w:tr>
+    </w:tbl>
+    <w:p>
+      <w:pPr>
+        <w:rPr>
+          <w:rFonts w:ascii="WPP" w:hAnsi="WPP"/>
+        </w:rPr>
+      </w:pPr>
+      <w:r>
+        <w:rPr>
+          <w:rFonts w:ascii="WPP" w:hAnsi="WPP"/>
+        </w:rPr>
+        <w:t>Se recomienda trabajar con información mensual</w:t>
+      </w:r>
+    </w:p>
+    <w:p>
+      <w:pPr>
+        <w:rPr>
+          <w:rFonts w:ascii="WPP" w:hAnsi="WPP"/>
+          <w:b/>
+          <w:bCs/>
+        </w:rPr>
+      </w:pPr>
+      <w:r>
+        <w:rPr>
+          <w:rFonts w:ascii="WPP" w:hAnsi="WPP"/>
+          <w:b/>
+          <w:bCs/>
+        </w:rPr>
+        <w:t>La App</w:t>
+      </w:r>
+    </w:p>
+    <w:p>
+      <w:pPr>
+        <w:rPr>
+          <w:rFonts w:ascii="WPP" w:hAnsi="WPP"/>
+        </w:rPr>
+      </w:pPr>
+      <w:r>
+        <w:rPr>
+          <w:rFonts w:ascii="WPP" w:hAnsi="WPP"/>
+        </w:rPr>
+        <w:t xml:space="preserve">El acceso a la App es el siguiente: </w:t>
+      </w:r>
+      <w:hyperlink r:id="rId5" w:tgtFrame="_blank" w:tooltip="https://mpredictive.streamlit.app/" w:history="1">
+        <w:r>
+          <w:rPr>
+            <w:rStyle w:val="Hipervnculo"/>
+            <w:rFonts w:ascii="WPP" w:hAnsi="WPP"/>
+          </w:rPr>
+          <w:t>https://mpre</w:t>
+        </w:r>
+        <w:r>
+          <w:rPr>
+            <w:rStyle w:val="Hipervnculo"/>
+            <w:rFonts w:ascii="WPP" w:hAnsi="WPP"/>
+          </w:rPr>
+          <w:t>d</w:t>
+        </w:r>
+        <w:r>
+          <w:rPr>
+            <w:rStyle w:val="Hipervnculo"/>
+            <w:rFonts w:ascii="WPP" w:hAnsi="WPP"/>
+          </w:rPr>
+          <w:t>ictive.streamlit.app/</w:t>
+        </w:r>
+      </w:hyperlink>
+    </w:p>
+    <w:p>
+      <w:pPr>
+        <w:rPr>
+          <w:rFonts w:ascii="WPP" w:hAnsi="WPP"/>
+        </w:rPr>
+      </w:pPr>
+      <w:r>
+        <w:rPr>
+          <w:rFonts w:ascii="WPP" w:hAnsi="WPP"/>
+        </w:rPr>
+        <w:t>La aplicación consiste en dos principales zonas:</w:t>
+      </w:r>
+    </w:p>
+    <w:p>
+      <w:pPr>
+        <w:pStyle w:val="Prrafodelista"/>
+        <w:numPr>
+          <w:ilvl w:val="0"/>
+          <w:numId w:val="2"/>
+        </w:numPr>
+        <w:rPr>
+          <w:rFonts w:ascii="WPP" w:hAnsi="WPP"/>
+        </w:rPr>
+      </w:pPr>
+      <w:r>
+        <w:rPr>
+          <w:rFonts w:ascii="WPP" w:hAnsi="WPP"/>
+        </w:rPr>
+        <w:t>Parámetros</w:t>
+      </w:r>
+    </w:p>
+    <w:p>
+      <w:pPr>
+        <w:pStyle w:val="Prrafodelista"/>
+        <w:numPr>
+          <w:ilvl w:val="0"/>
+          <w:numId w:val="2"/>
+        </w:numPr>
+        <w:rPr>
+          <w:rFonts w:ascii="WPP" w:hAnsi="WPP"/>
+        </w:rPr>
+      </w:pPr>
+      <w:proofErr w:type="spellStart"/>
+      <w:r>
+        <w:rPr>
+          <w:rFonts w:ascii="WPP" w:hAnsi="WPP"/>
+        </w:rPr>
+        <w:t>Analytics</w:t>
+      </w:r>
+      <w:proofErr w:type="spellEnd"/>
+    </w:p>
+    <w:p>
+      <w:pPr>
+        <w:rPr>
+          <w:rFonts w:ascii="WPP" w:hAnsi="WPP"/>
+        </w:rPr>
+      </w:pPr>
+      <w:r>
+        <w:rPr>
+          <w:rFonts w:ascii="WPP" w:hAnsi="WPP"/>
+          <w:noProof/>
+        </w:rPr>
+        <w:lastRenderedPageBreak/>
+        <w:drawing>
+          <wp:inline distT="0" distB="0" distL="0" distR="0" wp14:anchorId="41FD0C6E" wp14:editId="23D2A943">
+            <wp:extent cx="5724525" cy="3152140"/>
+            <wp:effectExtent l="0" t="0" r="9525" b="0"/>
+            <wp:docPr id="134691697" name="Imagen 4"/>
+            <wp:cNvGraphicFramePr>
+              <a:graphicFrameLocks xmlns:a="http://schemas.openxmlformats.org/drawingml/2006/main" noChangeAspect="1"/>
+            </wp:cNvGraphicFramePr>
+            <a:graphic xmlns:a="http://schemas.openxmlformats.org/drawingml/2006/main">
+              <a:graphicData uri="http://schemas.openxmlformats.org/drawingml/2006/picture">
+                <pic:pic xmlns:pic="http://schemas.openxmlformats.org/drawingml/2006/picture">
+                  <pic:nvPicPr>
+                    <pic:cNvPr id="0" name="Picture 2"/>
+                    <pic:cNvPicPr>
+                      <a:picLocks noChangeAspect="1" noChangeArrowheads="1"/>
+                    </pic:cNvPicPr>
+                  </pic:nvPicPr>
+                  <pic:blipFill>
+                    <a:blip r:embed="rId6">
+                      <a:extLst>
+                        <a:ext uri="{28A0092B-C50C-407E-A947-70E740481C1C}">
+                          <a14:useLocalDpi xmlns:a14="http://schemas.microsoft.com/office/drawing/2010/main" val="0"/>
+                        </a:ext>
+                      </a:extLst>
+                    </a:blip>
+                    <a:srcRect/>
+                    <a:stretch>
+                      <a:fillRect/>
+                    </a:stretch>
+                  </pic:blipFill>
+                  <pic:spPr bwMode="auto">
+                    <a:xfrm>
+                      <a:off x="0" y="0"/>
+                      <a:ext cx="5724525" cy="3152140"/>
+                    </a:xfrm>
+                    <a:prstGeom prst="rect">
+                      <a:avLst/>
+                    </a:prstGeom>
+                    <a:noFill/>
+                  </pic:spPr>
+                </pic:pic>
+              </a:graphicData>
+            </a:graphic>
+          </wp:inline>
+        </w:drawing>
+      </w:r>
+    </w:p>
+    <w:p>
+      <w:pPr>
+        <w:rPr>
+          <w:rFonts w:ascii="WPP" w:hAnsi="WPP"/>
+          <w:b/>
+          <w:bCs/>
+          <w:color w:val="00B050"/>
+        </w:rPr>
+      </w:pPr>
+      <w:r>
+        <w:rPr>
+          <w:rFonts w:ascii="WPP" w:hAnsi="WPP"/>
+          <w:b/>
+          <w:bCs/>
+          <w:color w:val="00B050"/>
+        </w:rPr>
+        <w:t xml:space="preserve">Sección de </w:t>
+      </w:r>
+      <w:r>
+        <w:rPr>
+          <w:rFonts w:ascii="WPP" w:hAnsi="WPP"/>
+          <w:b/>
+          <w:bCs/>
+          <w:color w:val="00B050"/>
+        </w:rPr>
+        <w:t>Parámetros.</w:t>
+      </w:r>
+    </w:p>
+    <w:p>
+      <w:pPr>
+        <w:rPr>
+          <w:rFonts w:ascii="WPP" w:hAnsi="WPP"/>
+        </w:rPr>
+      </w:pPr>
+      <w:r>
+        <w:rPr>
+          <w:rFonts w:ascii="WPP" w:hAnsi="WPP"/>
+        </w:rPr>
+        <w:t>Es la sección que permite parametrizar el modelo y los criterios con que se ejecutará, en este podrás encontrar:</w:t>
+      </w:r>
+    </w:p>
+    <w:p>
+      <w:pPr>
+        <w:rPr>
+          <w:rFonts w:ascii="WPP" w:hAnsi="WPP"/>
+        </w:rPr>
+      </w:pPr>
+      <w:proofErr w:type="gramStart"/>
+      <w:r>
+        <w:rPr>
+          <w:rFonts w:ascii="WPP" w:hAnsi="WPP"/>
+          <w:i/>
+          <w:iCs/>
+          <w:color w:val="00B050"/>
+        </w:rPr>
+        <w:t>Link</w:t>
+      </w:r>
+      <w:proofErr w:type="gramEnd"/>
+      <w:r>
+        <w:rPr>
+          <w:rFonts w:ascii="WPP" w:hAnsi="WPP"/>
+          <w:i/>
+          <w:iCs/>
+          <w:color w:val="00B050"/>
+        </w:rPr>
+        <w:t xml:space="preserve"> para descarga del </w:t>
+      </w:r>
+      <w:proofErr w:type="spellStart"/>
+      <w:r>
+        <w:rPr>
+          <w:rFonts w:ascii="WPP" w:hAnsi="WPP"/>
+          <w:i/>
+          <w:iCs/>
+          <w:color w:val="00B050"/>
+        </w:rPr>
+        <w:t>Template</w:t>
+      </w:r>
+      <w:proofErr w:type="spellEnd"/>
+      <w:r>
+        <w:rPr>
+          <w:rFonts w:ascii="WPP" w:hAnsi="WPP"/>
+          <w:i/>
+          <w:iCs/>
+          <w:color w:val="00B050"/>
+        </w:rPr>
+        <w:t>.</w:t>
+      </w:r>
+      <w:r>
+        <w:rPr>
+          <w:rFonts w:ascii="WPP" w:hAnsi="WPP"/>
+          <w:color w:val="00B050"/>
+        </w:rPr>
+        <w:t xml:space="preserve"> </w:t>
+      </w:r>
+      <w:r>
+        <w:rPr>
+          <w:rFonts w:ascii="WPP" w:hAnsi="WPP"/>
+        </w:rPr>
+        <w:t xml:space="preserve">Al dar clic harás descarga de un archivo CSV con los campos que utiliza el modelo, su formato, nombre de encabezados, orden y formato de contenido. Es muy importante que los campos de fecha tengan formato: </w:t>
+      </w:r>
+      <w:proofErr w:type="spellStart"/>
+      <w:r>
+        <w:rPr>
+          <w:rFonts w:ascii="WPP" w:hAnsi="WPP"/>
+        </w:rPr>
+        <w:t>dd</w:t>
+      </w:r>
+      <w:proofErr w:type="spellEnd"/>
+      <w:r>
+        <w:rPr>
+          <w:rFonts w:ascii="WPP" w:hAnsi="WPP"/>
+        </w:rPr>
+        <w:t>/mm/</w:t>
+      </w:r>
+      <w:proofErr w:type="spellStart"/>
+      <w:r>
+        <w:rPr>
+          <w:rFonts w:ascii="WPP" w:hAnsi="WPP"/>
+        </w:rPr>
+        <w:t>aaaa</w:t>
+      </w:r>
+      <w:proofErr w:type="spellEnd"/>
+      <w:r>
+        <w:rPr>
+          <w:rFonts w:ascii="WPP" w:hAnsi="WPP"/>
+        </w:rPr>
+        <w:t xml:space="preserve"> y las columnas con número tengan formato general</w:t>
+      </w:r>
+    </w:p>
+    <w:p>
+      <w:pPr>
+        <w:jc w:val="center"/>
+        <w:rPr>
+          <w:rFonts w:ascii="WPP" w:hAnsi="WPP"/>
+        </w:rPr>
+      </w:pPr>
+      <w:r>
+        <w:rPr>
+          <w:rFonts w:ascii="WPP" w:hAnsi="WPP"/>
+        </w:rPr>
+        <w:drawing>
+          <wp:inline distT="0" distB="0" distL="0" distR="0" wp14:anchorId="63B425E3" wp14:editId="111E584C">
+            <wp:extent cx="1781424" cy="781159"/>
+            <wp:effectExtent l="0" t="0" r="9525" b="0"/>
+            <wp:docPr id="2091123098" name="Imagen 1"/>
+            <wp:cNvGraphicFramePr>
+              <a:graphicFrameLocks xmlns:a="http://schemas.openxmlformats.org/drawingml/2006/main" noChangeAspect="1"/>
+            </wp:cNvGraphicFramePr>
+            <a:graphic xmlns:a="http://schemas.openxmlformats.org/drawingml/2006/main">
+              <a:graphicData uri="http://schemas.openxmlformats.org/drawingml/2006/picture">
+                <pic:pic xmlns:pic="http://schemas.openxmlformats.org/drawingml/2006/picture">
+                  <pic:nvPicPr>
+                    <pic:cNvPr id="2091123098" name=""/>
+                    <pic:cNvPicPr/>
+                  </pic:nvPicPr>
+                  <pic:blipFill>
+                    <a:blip r:embed="rId7"/>
+                    <a:stretch>
+                      <a:fillRect/>
+                    </a:stretch>
+                  </pic:blipFill>
+                  <pic:spPr>
+                    <a:xfrm>
+                      <a:off x="0" y="0"/>
+                      <a:ext cx="1781424" cy="781159"/>
+                    </a:xfrm>
+                    <a:prstGeom prst="rect">
+                      <a:avLst/>
+                    </a:prstGeom>
+                  </pic:spPr>
+                </pic:pic>
+              </a:graphicData>
+            </a:graphic>
+          </wp:inline>
+        </w:drawing>
+      </w:r>
+    </w:p>
+    <w:p>
+      <w:pPr>
+        <w:rPr>
+          <w:rFonts w:ascii="WPP" w:hAnsi="WPP"/>
+        </w:rPr>
+      </w:pPr>
+      <w:proofErr w:type="spellStart"/>
+      <w:r>
+        <w:rPr>
+          <w:rFonts w:ascii="WPP" w:hAnsi="WPP"/>
+          <w:i/>
+          <w:iCs/>
+          <w:color w:val="00B050"/>
+        </w:rPr>
+        <w:t>Browse</w:t>
+      </w:r>
+      <w:proofErr w:type="spellEnd"/>
+      <w:r>
+        <w:rPr>
+          <w:rFonts w:ascii="WPP" w:hAnsi="WPP"/>
+          <w:i/>
+          <w:iCs/>
+          <w:color w:val="00B050"/>
+        </w:rPr>
+        <w:t xml:space="preserve"> files</w:t>
+      </w:r>
+      <w:r>
+        <w:rPr>
+          <w:rFonts w:ascii="WPP" w:hAnsi="WPP"/>
+          <w:i/>
+          <w:iCs/>
+          <w:color w:val="00B050"/>
+        </w:rPr>
+        <w:t>.</w:t>
+      </w:r>
+      <w:r>
+        <w:rPr>
+          <w:rFonts w:ascii="WPP" w:hAnsi="WPP"/>
+          <w:color w:val="00B050"/>
+        </w:rPr>
+        <w:t xml:space="preserve"> </w:t>
+      </w:r>
+      <w:r>
+        <w:rPr>
+          <w:rFonts w:ascii="WPP" w:hAnsi="WPP"/>
+        </w:rPr>
+        <w:t>Es el botón para cargar la información en el formato mencionado anteriormente</w:t>
+      </w:r>
+    </w:p>
+    <w:p>
+      <w:pPr>
+        <w:jc w:val="center"/>
+        <w:rPr>
+          <w:rFonts w:ascii="WPP" w:hAnsi="WPP"/>
+        </w:rPr>
+      </w:pPr>
+      <w:r>
+        <w:rPr>
+          <w:rFonts w:ascii="WPP" w:hAnsi="WPP"/>
+        </w:rPr>
+        <w:lastRenderedPageBreak/>
+        <w:drawing>
+          <wp:inline distT="0" distB="0" distL="0" distR="0" wp14:anchorId="542E257D" wp14:editId="09610A00">
+            <wp:extent cx="2181529" cy="2419688"/>
+            <wp:effectExtent l="0" t="0" r="0" b="0"/>
+            <wp:docPr id="892536783" name="Imagen 1"/>
+            <wp:cNvGraphicFramePr>
+              <a:graphicFrameLocks xmlns:a="http://schemas.openxmlformats.org/drawingml/2006/main" noChangeAspect="1"/>
+            </wp:cNvGraphicFramePr>
+            <a:graphic xmlns:a="http://schemas.openxmlformats.org/drawingml/2006/main">
+              <a:graphicData uri="http://schemas.openxmlformats.org/drawingml/2006/picture">
+                <pic:pic xmlns:pic="http://schemas.openxmlformats.org/drawingml/2006/picture">
+                  <pic:nvPicPr>
+                    <pic:cNvPr id="892536783" name=""/>
+                    <pic:cNvPicPr/>
+                  </pic:nvPicPr>
+                  <pic:blipFill>
+                    <a:blip r:embed="rId8"/>
+                    <a:stretch>
+                      <a:fillRect/>
+                    </a:stretch>
+                  </pic:blipFill>
+                  <pic:spPr>
+                    <a:xfrm>
+                      <a:off x="0" y="0"/>
+                      <a:ext cx="2181529" cy="2419688"/>
+                    </a:xfrm>
+                    <a:prstGeom prst="rect">
+                      <a:avLst/>
+                    </a:prstGeom>
+                  </pic:spPr>
+                </pic:pic>
+              </a:graphicData>
+            </a:graphic>
+          </wp:inline>
+        </w:drawing>
+      </w:r>
+    </w:p>
+    <w:p>
+      <w:pPr>
+        <w:rPr>
+          <w:rFonts w:ascii="WPP" w:hAnsi="WPP"/>
+        </w:rPr>
+      </w:pPr>
+      <w:r>
+        <w:rPr>
+          <w:rFonts w:ascii="WPP" w:hAnsi="WPP"/>
+          <w:i/>
+          <w:iCs/>
+          <w:color w:val="00B050"/>
+        </w:rPr>
+        <w:t>Calibración del Análisis</w:t>
+      </w:r>
+      <w:r>
+        <w:rPr>
+          <w:rFonts w:ascii="WPP" w:hAnsi="WPP"/>
+          <w:i/>
+          <w:iCs/>
+          <w:color w:val="00B050"/>
+        </w:rPr>
+        <w:t>.</w:t>
+      </w:r>
+      <w:r>
+        <w:rPr>
+          <w:rFonts w:ascii="WPP" w:hAnsi="WPP"/>
+          <w:color w:val="00B050"/>
+        </w:rPr>
+        <w:t xml:space="preserve"> </w:t>
+      </w:r>
+      <w:r>
+        <w:rPr>
+          <w:rFonts w:ascii="WPP" w:hAnsi="WPP"/>
+        </w:rPr>
+        <w:t xml:space="preserve">En esta sección encontrarás algunos filtros que permitirán generar las consideraciones del modelo- </w:t>
+      </w:r>
+    </w:p>
+    <w:p>
+      <w:pPr>
+        <w:pStyle w:val="Prrafodelista"/>
+        <w:numPr>
+          <w:ilvl w:val="0"/>
+          <w:numId w:val="3"/>
+        </w:numPr>
+        <w:rPr>
+          <w:rFonts w:ascii="WPP" w:hAnsi="WPP"/>
+        </w:rPr>
+      </w:pPr>
+      <w:r>
+        <w:rPr>
+          <w:rFonts w:ascii="WPP" w:hAnsi="WPP"/>
+        </w:rPr>
+        <w:t>Selecciona la Marca para modelar</w:t>
+      </w:r>
+      <w:r>
+        <w:rPr>
+          <w:rFonts w:ascii="WPP" w:hAnsi="WPP"/>
+        </w:rPr>
+        <w:t xml:space="preserve">. Debes seleccionar si requieres modelar la experiencia del mercado (Total Categoría) o solo la información de la Marca. Se recomienda modelar a partir de la experiencia de la marca; es posible hacer distintos escenarios. </w:t>
+      </w:r>
+    </w:p>
+    <w:p>
+      <w:pPr>
+        <w:pStyle w:val="Prrafodelista"/>
+        <w:numPr>
+          <w:ilvl w:val="0"/>
+          <w:numId w:val="3"/>
+        </w:numPr>
+        <w:rPr>
+          <w:rFonts w:ascii="WPP" w:hAnsi="WPP"/>
+        </w:rPr>
+      </w:pPr>
+      <w:r>
+        <w:rPr>
+          <w:rFonts w:ascii="WPP" w:hAnsi="WPP"/>
+        </w:rPr>
+        <w:t>Selecciona Marca Propia:</w:t>
+      </w:r>
+      <w:r>
+        <w:rPr>
+          <w:rFonts w:ascii="WPP" w:hAnsi="WPP"/>
+        </w:rPr>
+        <w:t xml:space="preserve"> Seleccionar la marca de cliente. </w:t>
+      </w:r>
+    </w:p>
+    <w:p>
+      <w:pPr>
+        <w:pStyle w:val="Prrafodelista"/>
+        <w:numPr>
+          <w:ilvl w:val="0"/>
+          <w:numId w:val="3"/>
+        </w:numPr>
+        <w:rPr>
+          <w:rFonts w:ascii="WPP" w:hAnsi="WPP"/>
+        </w:rPr>
+      </w:pPr>
+      <w:r>
+        <w:rPr>
+          <w:rFonts w:ascii="WPP" w:hAnsi="WPP"/>
+        </w:rPr>
+        <w:t>Selecciona el KPI a modelar:</w:t>
+      </w:r>
+      <w:r>
+        <w:rPr>
+          <w:rFonts w:ascii="WPP" w:hAnsi="WPP"/>
+        </w:rPr>
+        <w:t xml:space="preserve"> En el archivo input tienes la facilidad de cargar más de un KPI para analizar por lo que puedes trabajar distintos modelos</w:t>
+      </w:r>
+    </w:p>
+    <w:p>
+      <w:pPr>
+        <w:pStyle w:val="Prrafodelista"/>
+        <w:numPr>
+          <w:ilvl w:val="0"/>
+          <w:numId w:val="3"/>
+        </w:numPr>
+        <w:rPr>
+          <w:rFonts w:ascii="WPP" w:hAnsi="WPP"/>
+        </w:rPr>
+      </w:pPr>
+      <w:r>
+        <w:rPr>
+          <w:rFonts w:ascii="WPP" w:hAnsi="WPP"/>
+        </w:rPr>
+        <w:t>Naturaleza del KPI:</w:t>
+      </w:r>
+      <w:r>
+        <w:rPr>
+          <w:rFonts w:ascii="WPP" w:hAnsi="WPP"/>
+        </w:rPr>
+        <w:t xml:space="preserve"> Es importante señalar si el KPI se debe operar bajo la consideración de un promedio o por totales, para valores en porcentaje como: Brand Health, CTR, ROI se recomienda usar Promedio, en el caso de Ventas, Leads, Visitas se recomienda usas Totales</w:t>
+      </w:r>
+    </w:p>
+    <w:p>
+      <w:pPr>
+        <w:pStyle w:val="Prrafodelista"/>
+        <w:jc w:val="center"/>
+        <w:rPr>
+          <w:rFonts w:ascii="WPP" w:hAnsi="WPP"/>
+        </w:rPr>
+      </w:pPr>
+      <w:r>
+        <w:rPr>
+          <w:rFonts w:ascii="WPP" w:hAnsi="WPP"/>
+        </w:rPr>
+        <w:lastRenderedPageBreak/>
+        <w:drawing>
+          <wp:inline distT="0" distB="0" distL="0" distR="0" wp14:anchorId="6AC95074" wp14:editId="482063A8">
+            <wp:extent cx="2086266" cy="4458322"/>
+            <wp:effectExtent l="0" t="0" r="9525" b="0"/>
+            <wp:docPr id="1904551522" name="Imagen 1"/>
+            <wp:cNvGraphicFramePr>
+              <a:graphicFrameLocks xmlns:a="http://schemas.openxmlformats.org/drawingml/2006/main" noChangeAspect="1"/>
+            </wp:cNvGraphicFramePr>
+            <a:graphic xmlns:a="http://schemas.openxmlformats.org/drawingml/2006/main">
+              <a:graphicData uri="http://schemas.openxmlformats.org/drawingml/2006/picture">
+                <pic:pic xmlns:pic="http://schemas.openxmlformats.org/drawingml/2006/picture">
+                  <pic:nvPicPr>
+                    <pic:cNvPr id="1904551522" name=""/>
+                    <pic:cNvPicPr/>
+                  </pic:nvPicPr>
+                  <pic:blipFill>
+                    <a:blip r:embed="rId9"/>
+                    <a:stretch>
+                      <a:fillRect/>
+                    </a:stretch>
+                  </pic:blipFill>
+                  <pic:spPr>
+                    <a:xfrm>
+                      <a:off x="0" y="0"/>
+                      <a:ext cx="2086266" cy="4458322"/>
+                    </a:xfrm>
+                    <a:prstGeom prst="rect">
+                      <a:avLst/>
+                    </a:prstGeom>
+                  </pic:spPr>
+                </pic:pic>
+              </a:graphicData>
+            </a:graphic>
+          </wp:inline>
+        </w:drawing>
+      </w:r>
+    </w:p>
+    <w:p>
+      <w:pPr>
+        <w:ind w:left="360"/>
+        <w:rPr>
+          <w:rFonts w:ascii="WPP" w:hAnsi="WPP"/>
+          <w:i/>
+          <w:iCs/>
+          <w:color w:val="00B050"/>
+        </w:rPr>
+      </w:pPr>
+      <w:r>
+        <w:rPr>
+          <w:rFonts w:ascii="WPP" w:hAnsi="WPP"/>
+          <w:i/>
+          <w:iCs/>
+          <w:color w:val="00B050"/>
+        </w:rPr>
+        <w:t xml:space="preserve">Ayuda. </w:t>
+      </w:r>
+    </w:p>
+    <w:p>
+      <w:pPr>
+        <w:ind w:left="360"/>
+        <w:rPr>
+          <w:rFonts w:ascii="WPP" w:hAnsi="WPP"/>
+        </w:rPr>
+      </w:pPr>
+      <w:r>
+        <w:rPr>
+          <w:rFonts w:ascii="WPP" w:hAnsi="WPP"/>
+        </w:rPr>
+        <w:t xml:space="preserve">En esta sección podrás encontrar las ultimas actualizaciones de la documentación o </w:t>
+      </w:r>
+      <w:proofErr w:type="gramStart"/>
+      <w:r>
+        <w:rPr>
+          <w:rFonts w:ascii="WPP" w:hAnsi="WPP"/>
+        </w:rPr>
+        <w:t>Tips</w:t>
+      </w:r>
+      <w:proofErr w:type="gramEnd"/>
+      <w:r>
+        <w:rPr>
+          <w:rFonts w:ascii="WPP" w:hAnsi="WPP"/>
+        </w:rPr>
+        <w:t xml:space="preserve"> así como soporte directo del equipo de desarrollo. </w:t>
+      </w:r>
+    </w:p>
+    <w:p>
+      <w:pPr>
+        <w:ind w:left="360"/>
+        <w:jc w:val="center"/>
+        <w:rPr>
+          <w:rFonts w:ascii="WPP" w:hAnsi="WPP"/>
+        </w:rPr>
+      </w:pPr>
+      <w:r>
+        <w:rPr>
+          <w:rFonts w:ascii="WPP" w:hAnsi="WPP"/>
+        </w:rPr>
+        <w:drawing>
+          <wp:inline distT="0" distB="0" distL="0" distR="0" wp14:anchorId="1D9C0511" wp14:editId="057B1946">
+            <wp:extent cx="2152950" cy="676369"/>
+            <wp:effectExtent l="0" t="0" r="0" b="9525"/>
+            <wp:docPr id="765737189" name="Imagen 1"/>
+            <wp:cNvGraphicFramePr>
+              <a:graphicFrameLocks xmlns:a="http://schemas.openxmlformats.org/drawingml/2006/main" noChangeAspect="1"/>
+            </wp:cNvGraphicFramePr>
+            <a:graphic xmlns:a="http://schemas.openxmlformats.org/drawingml/2006/main">
+              <a:graphicData uri="http://schemas.openxmlformats.org/drawingml/2006/picture">
+                <pic:pic xmlns:pic="http://schemas.openxmlformats.org/drawingml/2006/picture">
+                  <pic:nvPicPr>
+                    <pic:cNvPr id="765737189" name=""/>
+                    <pic:cNvPicPr/>
+                  </pic:nvPicPr>
+                  <pic:blipFill>
+                    <a:blip r:embed="rId10"/>
+                    <a:stretch>
+                      <a:fillRect/>
+                    </a:stretch>
+                  </pic:blipFill>
+                  <pic:spPr>
+                    <a:xfrm>
+                      <a:off x="0" y="0"/>
+                      <a:ext cx="2152950" cy="676369"/>
+                    </a:xfrm>
+                    <a:prstGeom prst="rect">
+                      <a:avLst/>
+                    </a:prstGeom>
+                  </pic:spPr>
+                </pic:pic>
+              </a:graphicData>
+            </a:graphic>
+          </wp:inline>
+        </w:drawing>
+      </w:r>
+    </w:p>
+    <w:p>
+      <w:pPr>
+        <w:ind w:left="360"/>
+        <w:rPr>
+          <w:rFonts w:ascii="WPP" w:hAnsi="WPP"/>
+        </w:rPr>
+      </w:pPr>
+    </w:p>
+    <w:p>
+      <w:pPr>
+        <w:ind w:left="360"/>
+        <w:rPr>
+          <w:rFonts w:ascii="WPP" w:hAnsi="WPP"/>
+        </w:rPr>
+      </w:pPr>
+    </w:p>
+    <w:p>
+      <w:pPr>
+        <w:ind w:left="360"/>
+        <w:rPr>
+          <w:rFonts w:ascii="WPP" w:hAnsi="WPP"/>
+        </w:rPr>
+      </w:pPr>
+    </w:p>
+    <w:p>
+      <w:pPr>
+        <w:ind w:left="360"/>
+        <w:rPr>
+          <w:rFonts w:ascii="WPP" w:hAnsi="WPP"/>
+        </w:rPr>
+      </w:pPr>
+    </w:p>
+    <w:p>
+      <w:pPr>
+        <w:ind w:left="360"/>
+        <w:rPr>
+          <w:rFonts w:ascii="WPP" w:hAnsi="WPP"/>
+        </w:rPr>
+      </w:pPr>
+    </w:p>
+    <w:p>
+      <w:pPr>
+        <w:ind w:left="360"/>
+        <w:rPr>
+          <w:rFonts w:ascii="WPP" w:hAnsi="WPP"/>
+        </w:rPr>
+      </w:pPr>
+    </w:p>
+    <w:p>
+      <w:pPr>
+        <w:ind w:left="360"/>
+        <w:rPr>
+          <w:rFonts w:ascii="WPP" w:hAnsi="WPP"/>
+          <w:b/>
+          <w:bCs/>
+          <w:color w:val="00B0F0"/>
+        </w:rPr>
+      </w:pPr>
+      <w:r>
+        <w:rPr>
+          <w:rFonts w:ascii="WPP" w:hAnsi="WPP"/>
+          <w:b/>
+          <w:bCs/>
+          <w:color w:val="00B0F0"/>
+        </w:rPr>
+        <w:lastRenderedPageBreak/>
+        <w:t xml:space="preserve">Sección de </w:t>
+      </w:r>
+      <w:proofErr w:type="spellStart"/>
+      <w:r>
+        <w:rPr>
+          <w:rFonts w:ascii="WPP" w:hAnsi="WPP"/>
+          <w:b/>
+          <w:bCs/>
+          <w:color w:val="00B0F0"/>
+        </w:rPr>
+        <w:t>Analytics</w:t>
+      </w:r>
+      <w:proofErr w:type="spellEnd"/>
+      <w:r>
+        <w:rPr>
+          <w:rFonts w:ascii="WPP" w:hAnsi="WPP"/>
+          <w:b/>
+          <w:bCs/>
+          <w:color w:val="00B0F0"/>
+        </w:rPr>
+        <w:t>.</w:t>
+      </w:r>
+    </w:p>
+    <w:p>
+      <w:pPr>
+        <w:ind w:left="360"/>
+        <w:rPr>
+          <w:rFonts w:ascii="WPP" w:hAnsi="WPP"/>
+        </w:rPr>
+      </w:pPr>
+      <w:r>
+        <w:rPr>
+          <w:rFonts w:ascii="WPP" w:hAnsi="WPP"/>
+        </w:rPr>
+        <w:t xml:space="preserve">Esta área de trabajo está definida por tres pestañas: </w:t>
+      </w:r>
+    </w:p>
+    <w:p>
+      <w:pPr>
+        <w:ind w:left="360"/>
+        <w:rPr>
+          <w:rFonts w:ascii="WPP" w:hAnsi="WPP"/>
+        </w:rPr>
+      </w:pPr>
+      <w:r>
+        <w:rPr>
+          <w:rFonts w:ascii="WPP" w:hAnsi="WPP"/>
+        </w:rPr>
+        <w:drawing>
+          <wp:inline distT="0" distB="0" distL="0" distR="0" wp14:anchorId="5E853977" wp14:editId="37FA7C6C">
+            <wp:extent cx="5353797" cy="695422"/>
+            <wp:effectExtent l="0" t="0" r="0" b="9525"/>
+            <wp:docPr id="919120068" name="Imagen 1"/>
+            <wp:cNvGraphicFramePr>
+              <a:graphicFrameLocks xmlns:a="http://schemas.openxmlformats.org/drawingml/2006/main" noChangeAspect="1"/>
+            </wp:cNvGraphicFramePr>
+            <a:graphic xmlns:a="http://schemas.openxmlformats.org/drawingml/2006/main">
+              <a:graphicData uri="http://schemas.openxmlformats.org/drawingml/2006/picture">
+                <pic:pic xmlns:pic="http://schemas.openxmlformats.org/drawingml/2006/picture">
+                  <pic:nvPicPr>
+                    <pic:cNvPr id="919120068" name=""/>
+                    <pic:cNvPicPr/>
+                  </pic:nvPicPr>
+                  <pic:blipFill>
+                    <a:blip r:embed="rId11"/>
+                    <a:stretch>
+                      <a:fillRect/>
+                    </a:stretch>
+                  </pic:blipFill>
+                  <pic:spPr>
+                    <a:xfrm>
+                      <a:off x="0" y="0"/>
+                      <a:ext cx="5353797" cy="695422"/>
+                    </a:xfrm>
+                    <a:prstGeom prst="rect">
+                      <a:avLst/>
+                    </a:prstGeom>
+                  </pic:spPr>
+                </pic:pic>
+              </a:graphicData>
+            </a:graphic>
+          </wp:inline>
+        </w:drawing>
+      </w:r>
+    </w:p>
+    <w:p>
+      <w:pPr>
+        <w:ind w:left="360"/>
+        <w:rPr>
+          <w:rFonts w:ascii="WPP" w:hAnsi="WPP"/>
+        </w:rPr>
+      </w:pPr>
+      <w:r>
+        <w:rPr>
+          <w:rFonts w:ascii="WPP" w:hAnsi="WPP"/>
+        </w:rPr>
+        <w:t xml:space="preserve">Cada pestaña se resaltan las letras en rojo cuando se encuentra activa. </w:t>
+      </w:r>
+    </w:p>
+    <w:p>
+      <w:pPr>
+        <w:ind w:left="360"/>
+        <w:rPr>
+          <w:rFonts w:ascii="WPP" w:hAnsi="WPP"/>
+        </w:rPr>
+      </w:pPr>
+      <w:r>
+        <w:rPr>
+          <w:rFonts w:ascii="WPP" w:hAnsi="WPP"/>
+          <w:i/>
+          <w:iCs/>
+        </w:rPr>
+        <w:t>Análisis Visual</w:t>
+      </w:r>
+      <w:r>
+        <w:rPr>
+          <w:rFonts w:ascii="WPP" w:hAnsi="WPP"/>
+        </w:rPr>
+        <w:t xml:space="preserve">. </w:t>
+      </w:r>
+    </w:p>
+    <w:p>
+      <w:pPr>
+        <w:ind w:left="360"/>
+        <w:rPr>
+          <w:rFonts w:ascii="WPP" w:hAnsi="WPP"/>
+        </w:rPr>
+      </w:pPr>
+      <w:r>
+        <w:rPr>
+          <w:rFonts w:ascii="WPP" w:hAnsi="WPP"/>
+        </w:rPr>
+        <w:t xml:space="preserve">Es el área para hacer un Análisis Exploratorio de Datos, con tiene estadísticas básicas y evolución de los </w:t>
+      </w:r>
+      <w:proofErr w:type="spellStart"/>
+      <w:proofErr w:type="gramStart"/>
+      <w:r>
+        <w:rPr>
+          <w:rFonts w:ascii="WPP" w:hAnsi="WPP"/>
+        </w:rPr>
+        <w:t>KPIs</w:t>
+      </w:r>
+      <w:proofErr w:type="spellEnd"/>
+      <w:proofErr w:type="gramEnd"/>
+      <w:r>
+        <w:rPr>
+          <w:rFonts w:ascii="WPP" w:hAnsi="WPP"/>
+        </w:rPr>
+        <w:t xml:space="preserve"> así como de la inversión de medios</w:t>
+      </w:r>
+    </w:p>
+    <w:p>
+      <w:pPr>
+        <w:ind w:left="360"/>
+        <w:rPr>
+          <w:rFonts w:ascii="WPP" w:hAnsi="WPP"/>
+        </w:rPr>
+      </w:pPr>
+      <w:r>
+        <w:rPr>
+          <w:rFonts w:ascii="WPP" w:hAnsi="WPP"/>
+        </w:rPr>
+        <w:drawing>
+          <wp:inline distT="0" distB="0" distL="0" distR="0" wp14:anchorId="1F840E2F" wp14:editId="2820D779">
+            <wp:extent cx="5612130" cy="2855595"/>
+            <wp:effectExtent l="0" t="0" r="7620" b="1905"/>
+            <wp:docPr id="67808353" name="Imagen 1"/>
+            <wp:cNvGraphicFramePr>
+              <a:graphicFrameLocks xmlns:a="http://schemas.openxmlformats.org/drawingml/2006/main" noChangeAspect="1"/>
+            </wp:cNvGraphicFramePr>
+            <a:graphic xmlns:a="http://schemas.openxmlformats.org/drawingml/2006/main">
+              <a:graphicData uri="http://schemas.openxmlformats.org/drawingml/2006/picture">
+                <pic:pic xmlns:pic="http://schemas.openxmlformats.org/drawingml/2006/picture">
+                  <pic:nvPicPr>
+                    <pic:cNvPr id="67808353" name=""/>
+                    <pic:cNvPicPr/>
+                  </pic:nvPicPr>
+                  <pic:blipFill>
+                    <a:blip r:embed="rId12"/>
+                    <a:stretch>
+                      <a:fillRect/>
+                    </a:stretch>
+                  </pic:blipFill>
+                  <pic:spPr>
+                    <a:xfrm>
+                      <a:off x="0" y="0"/>
+                      <a:ext cx="5612130" cy="2855595"/>
+                    </a:xfrm>
+                    <a:prstGeom prst="rect">
+                      <a:avLst/>
+                    </a:prstGeom>
+                  </pic:spPr>
+                </pic:pic>
+              </a:graphicData>
+            </a:graphic>
+          </wp:inline>
+        </w:drawing>
+      </w:r>
+    </w:p>
+    <w:p>
+      <w:pPr>
+        <w:ind w:left="360"/>
+        <w:rPr>
+          <w:rFonts w:ascii="WPP" w:hAnsi="WPP"/>
+          <w:i/>
+          <w:iCs/>
+        </w:rPr>
+      </w:pPr>
+      <w:r>
+        <w:rPr>
+          <w:rFonts w:ascii="WPP" w:hAnsi="WPP"/>
+          <w:i/>
+          <w:iCs/>
+        </w:rPr>
+        <w:t>Modelo Predictivo</w:t>
+      </w:r>
+    </w:p>
+    <w:p>
+      <w:pPr>
+        <w:ind w:left="360"/>
+        <w:rPr>
+          <w:rFonts w:ascii="WPP" w:hAnsi="WPP"/>
+        </w:rPr>
+      </w:pPr>
+      <w:r>
+        <w:rPr>
+          <w:rFonts w:ascii="WPP" w:hAnsi="WPP"/>
+        </w:rPr>
+        <w:t>Es la pestaña donde se desarrolla el modelo para responder cuál será el impacto de media en el negocio</w:t>
+      </w:r>
+    </w:p>
+    <w:p>
+      <w:pPr>
+        <w:ind w:left="360" w:firstLine="348"/>
+        <w:rPr>
+          <w:rFonts w:ascii="WPP" w:hAnsi="WPP"/>
+        </w:rPr>
+      </w:pPr>
+      <w:r>
+        <w:rPr>
+          <w:rFonts w:ascii="WPP" w:hAnsi="WPP"/>
+        </w:rPr>
+        <w:t xml:space="preserve">Pantalla inicial para el modelo </w:t>
+      </w:r>
+    </w:p>
+    <w:p>
+      <w:pPr>
+        <w:ind w:left="360" w:firstLine="348"/>
+        <w:rPr>
+          <w:rFonts w:ascii="WPP" w:hAnsi="WPP"/>
+        </w:rPr>
+      </w:pPr>
+      <w:r>
+        <w:rPr>
+          <w:rFonts w:ascii="WPP" w:hAnsi="WPP"/>
+          <w:noProof/>
+        </w:rPr>
+        <w:lastRenderedPageBreak/>
+        <w:drawing>
+          <wp:inline distT="0" distB="0" distL="0" distR="0" wp14:anchorId="0EF711DB" wp14:editId="3774AA51">
+            <wp:extent cx="5128028" cy="1933575"/>
+            <wp:effectExtent l="0" t="0" r="0" b="0"/>
+            <wp:docPr id="1053272798" name="Imagen 5"/>
+            <wp:cNvGraphicFramePr>
+              <a:graphicFrameLocks xmlns:a="http://schemas.openxmlformats.org/drawingml/2006/main" noChangeAspect="1"/>
+            </wp:cNvGraphicFramePr>
+            <a:graphic xmlns:a="http://schemas.openxmlformats.org/drawingml/2006/main">
+              <a:graphicData uri="http://schemas.openxmlformats.org/drawingml/2006/picture">
+                <pic:pic xmlns:pic="http://schemas.openxmlformats.org/drawingml/2006/picture">
+                  <pic:nvPicPr>
+                    <pic:cNvPr id="0" name="Picture 3"/>
+                    <pic:cNvPicPr>
+                      <a:picLocks noChangeAspect="1" noChangeArrowheads="1"/>
+                    </pic:cNvPicPr>
+                  </pic:nvPicPr>
+                  <pic:blipFill>
+                    <a:blip r:embed="rId13" cstate="print">
+                      <a:extLst>
+                        <a:ext uri="{28A0092B-C50C-407E-A947-70E740481C1C}">
+                          <a14:useLocalDpi xmlns:a14="http://schemas.microsoft.com/office/drawing/2010/main" val="0"/>
+                        </a:ext>
+                      </a:extLst>
+                    </a:blip>
+                    <a:srcRect/>
+                    <a:stretch>
+                      <a:fillRect/>
+                    </a:stretch>
+                  </pic:blipFill>
+                  <pic:spPr bwMode="auto">
+                    <a:xfrm>
+                      <a:off x="0" y="0"/>
+                      <a:ext cx="5135564" cy="1936416"/>
+                    </a:xfrm>
+                    <a:prstGeom prst="rect">
+                      <a:avLst/>
+                    </a:prstGeom>
+                    <a:noFill/>
+                  </pic:spPr>
+                </pic:pic>
+              </a:graphicData>
+            </a:graphic>
+          </wp:inline>
+        </w:drawing>
+      </w:r>
+    </w:p>
+    <w:p>
+      <w:pPr>
+        <w:ind w:left="360" w:firstLine="348"/>
+        <w:rPr>
+          <w:rFonts w:ascii="WPP" w:hAnsi="WPP"/>
+        </w:rPr>
+      </w:pPr>
+    </w:p>
+    <w:p>
+      <w:pPr>
+        <w:ind w:left="360" w:firstLine="348"/>
+        <w:rPr>
+          <w:rFonts w:ascii="WPP" w:hAnsi="WPP"/>
+        </w:rPr>
+      </w:pPr>
+      <w:r>
+        <w:rPr>
+          <w:rFonts w:ascii="WPP" w:hAnsi="WPP"/>
+        </w:rPr>
+        <w:t>Antes de correr el modelo es necesario definir la inversión de Campaña y Duración para después ejecutar el modelo con el botón “Calcular Impacto de Campaña”</w:t>
+      </w:r>
+    </w:p>
+    <w:p>
+      <w:pPr>
+        <w:ind w:left="360" w:firstLine="348"/>
+        <w:rPr>
+          <w:rFonts w:ascii="WPP" w:hAnsi="WPP"/>
+        </w:rPr>
+      </w:pPr>
+    </w:p>
+    <w:p>
+      <w:pPr>
+        <w:ind w:left="360" w:firstLine="348"/>
+        <w:rPr>
+          <w:rFonts w:ascii="WPP" w:hAnsi="WPP"/>
+        </w:rPr>
+      </w:pPr>
+      <w:r>
+        <w:rPr>
+          <w:rFonts w:ascii="WPP" w:hAnsi="WPP"/>
+        </w:rPr>
+        <w:t>Resultados clave del ejercicio.</w:t>
+      </w:r>
+    </w:p>
+    <w:p>
+      <w:pPr>
+        <w:pStyle w:val="Prrafodelista"/>
+        <w:numPr>
+          <w:ilvl w:val="0"/>
+          <w:numId w:val="4"/>
+        </w:numPr>
+        <w:rPr>
+          <w:rFonts w:ascii="WPP" w:hAnsi="WPP"/>
+        </w:rPr>
+      </w:pPr>
+      <w:proofErr w:type="spellStart"/>
+      <w:r>
+        <w:rPr>
+          <w:rFonts w:ascii="WPP" w:hAnsi="WPP"/>
+          <w:i/>
+          <w:iCs/>
+        </w:rPr>
+        <w:t>Lift</w:t>
+      </w:r>
+      <w:proofErr w:type="spellEnd"/>
+      <w:r>
+        <w:rPr>
+          <w:rFonts w:ascii="WPP" w:hAnsi="WPP"/>
+        </w:rPr>
+        <w:t xml:space="preserve"> total campaña. Es el resultado directo </w:t>
+      </w:r>
+      <w:proofErr w:type="gramStart"/>
+      <w:r>
+        <w:rPr>
+          <w:rFonts w:ascii="WPP" w:hAnsi="WPP"/>
+        </w:rPr>
+        <w:t>a la objetivo</w:t>
+      </w:r>
+      <w:proofErr w:type="gramEnd"/>
+      <w:r>
+        <w:rPr>
+          <w:rFonts w:ascii="WPP" w:hAnsi="WPP"/>
+        </w:rPr>
+        <w:t xml:space="preserve"> de la herramienta</w:t>
+      </w:r>
+    </w:p>
+    <w:p>
+      <w:pPr>
+        <w:pStyle w:val="Prrafodelista"/>
+        <w:numPr>
+          <w:ilvl w:val="0"/>
+          <w:numId w:val="4"/>
+        </w:numPr>
+        <w:rPr>
+          <w:rFonts w:ascii="WPP" w:hAnsi="WPP"/>
+        </w:rPr>
+      </w:pPr>
+      <w:proofErr w:type="spellStart"/>
+      <w:r>
+        <w:rPr>
+          <w:rFonts w:ascii="WPP" w:hAnsi="WPP"/>
+          <w:i/>
+          <w:iCs/>
+        </w:rPr>
+        <w:t>Benchmark</w:t>
+      </w:r>
+      <w:proofErr w:type="spellEnd"/>
+      <w:r>
+        <w:rPr>
+          <w:rFonts w:ascii="WPP" w:hAnsi="WPP"/>
+        </w:rPr>
+        <w:t>. Se contextualiza el nivel de crecimiento que genera medios respecto al crecimiento orgánico que tiene la marca</w:t>
+      </w:r>
+    </w:p>
+    <w:p>
+      <w:pPr>
+        <w:pStyle w:val="Prrafodelista"/>
+        <w:numPr>
+          <w:ilvl w:val="0"/>
+          <w:numId w:val="4"/>
+        </w:numPr>
+        <w:rPr>
+          <w:rFonts w:ascii="WPP" w:hAnsi="WPP"/>
+        </w:rPr>
+      </w:pPr>
+      <w:proofErr w:type="spellStart"/>
+      <w:r>
+        <w:rPr>
+          <w:rFonts w:ascii="WPP" w:hAnsi="WPP"/>
+          <w:i/>
+          <w:iCs/>
+        </w:rPr>
+        <w:t>Indice</w:t>
+      </w:r>
+      <w:proofErr w:type="spellEnd"/>
+      <w:r>
+        <w:rPr>
+          <w:rFonts w:ascii="WPP" w:hAnsi="WPP"/>
+          <w:i/>
+          <w:iCs/>
+        </w:rPr>
+        <w:t xml:space="preserve"> de Saturación</w:t>
+      </w:r>
+      <w:r>
+        <w:rPr>
+          <w:rFonts w:ascii="WPP" w:hAnsi="WPP"/>
+        </w:rPr>
+        <w:t xml:space="preserve">. Indica cuando la inversión en medio responde a un comportamiento más sencillo o difícil de mover, por </w:t>
+      </w:r>
+      <w:proofErr w:type="gramStart"/>
+      <w:r>
+        <w:rPr>
+          <w:rFonts w:ascii="WPP" w:hAnsi="WPP"/>
+        </w:rPr>
+        <w:t>ejemplo</w:t>
+      </w:r>
+      <w:proofErr w:type="gramEnd"/>
+      <w:r>
+        <w:rPr>
+          <w:rFonts w:ascii="WPP" w:hAnsi="WPP"/>
+        </w:rPr>
+        <w:t xml:space="preserve"> un Índice de Saturación debajo de 30 es adecuado para continuar haciendo inversión porque es sensible a crecimientos, mientras que arriba de 30 la inversión resulta topada para generar re</w:t>
+      </w:r>
+      <w:r>
+        <w:rPr>
+          <w:rFonts w:ascii="WPP" w:hAnsi="WPP"/>
+        </w:rPr>
+        <w:t>s</w:t>
+      </w:r>
+      <w:r>
+        <w:rPr>
+          <w:rFonts w:ascii="WPP" w:hAnsi="WPP"/>
+        </w:rPr>
+        <w:t>ultados</w:t>
+      </w:r>
+    </w:p>
+    <w:p>
+      <w:pPr>
+        <w:rPr>
+          <w:rFonts w:ascii="WPP" w:hAnsi="WPP"/>
+        </w:rPr>
+      </w:pPr>
+    </w:p>
+    <w:p>
+      <w:pPr>
+        <w:rPr>
+          <w:rFonts w:ascii="WPP" w:hAnsi="WPP"/>
+        </w:rPr>
+      </w:pPr>
+    </w:p>
+    <w:p>
+      <w:pPr>
+        <w:rPr>
+          <w:rFonts w:ascii="WPP" w:hAnsi="WPP"/>
+        </w:rPr>
+      </w:pPr>
+    </w:p>
+    <w:p>
+      <w:pPr>
+        <w:rPr>
+          <w:rFonts w:ascii="WPP" w:hAnsi="WPP"/>
+        </w:rPr>
+      </w:pPr>
+    </w:p>
+    <w:p>
+      <w:pPr>
+        <w:rPr>
+          <w:rFonts w:ascii="WPP" w:hAnsi="WPP"/>
+        </w:rPr>
+      </w:pPr>
+    </w:p>
+    <w:p>
+      <w:pPr>
+        <w:rPr>
+          <w:rFonts w:ascii="WPP" w:hAnsi="WPP"/>
+        </w:rPr>
+      </w:pPr>
+    </w:p>
+    <w:p>
+      <w:pPr>
+        <w:ind w:left="1068"/>
+        <w:rPr>
+          <w:rFonts w:ascii="WPP" w:hAnsi="WPP"/>
+        </w:rPr>
+      </w:pPr>
+      <w:r>
+        <w:rPr>
+          <w:rFonts w:ascii="WPP" w:hAnsi="WPP"/>
+        </w:rPr>
+        <w:lastRenderedPageBreak/>
+        <w:t>Curva de Predicción</w:t>
+      </w:r>
+    </w:p>
+    <w:p>
+      <w:pPr>
+        <w:ind w:left="1068"/>
+        <w:rPr>
+          <w:rFonts w:ascii="WPP" w:hAnsi="WPP"/>
+        </w:rPr>
+      </w:pPr>
+      <w:r>
+        <w:rPr>
+          <w:rFonts w:ascii="WPP" w:hAnsi="WPP"/>
+        </w:rPr>
+        <w:t xml:space="preserve">Recorre </w:t>
+      </w:r>
+      <w:proofErr w:type="spellStart"/>
+      <w:r>
+        <w:rPr>
+          <w:rFonts w:ascii="WPP" w:hAnsi="WPP"/>
+        </w:rPr>
+        <w:t>lo</w:t>
+      </w:r>
+      <w:proofErr w:type="spellEnd"/>
+      <w:r>
+        <w:rPr>
+          <w:rFonts w:ascii="WPP" w:hAnsi="WPP"/>
+        </w:rPr>
+        <w:t xml:space="preserve"> niveles de inversión para plantear escenarios de recorte o aumento de inversión</w:t>
+      </w:r>
+    </w:p>
+    <w:p>
+      <w:pPr>
+        <w:ind w:left="1068"/>
+        <w:jc w:val="center"/>
+        <w:rPr>
+          <w:rFonts w:ascii="WPP" w:hAnsi="WPP"/>
+        </w:rPr>
+      </w:pPr>
+      <w:r>
+        <w:rPr>
+          <w:rFonts w:ascii="WPP" w:hAnsi="WPP"/>
+        </w:rPr>
+        <w:drawing>
+          <wp:inline distT="0" distB="0" distL="0" distR="0" wp14:anchorId="11B6C244" wp14:editId="2B476034">
+            <wp:extent cx="3810000" cy="2656395"/>
+            <wp:effectExtent l="0" t="0" r="0" b="0"/>
+            <wp:docPr id="689352147" name="Imagen 1"/>
+            <wp:cNvGraphicFramePr>
+              <a:graphicFrameLocks xmlns:a="http://schemas.openxmlformats.org/drawingml/2006/main" noChangeAspect="1"/>
+            </wp:cNvGraphicFramePr>
+            <a:graphic xmlns:a="http://schemas.openxmlformats.org/drawingml/2006/main">
+              <a:graphicData uri="http://schemas.openxmlformats.org/drawingml/2006/picture">
+                <pic:pic xmlns:pic="http://schemas.openxmlformats.org/drawingml/2006/picture">
+                  <pic:nvPicPr>
+                    <pic:cNvPr id="689352147" name=""/>
+                    <pic:cNvPicPr/>
+                  </pic:nvPicPr>
+                  <pic:blipFill>
+                    <a:blip r:embed="rId14"/>
+                    <a:stretch>
+                      <a:fillRect/>
+                    </a:stretch>
+                  </pic:blipFill>
+                  <pic:spPr>
+                    <a:xfrm>
+                      <a:off x="0" y="0"/>
+                      <a:ext cx="3817615" cy="2661704"/>
+                    </a:xfrm>
+                    <a:prstGeom prst="rect">
+                      <a:avLst/>
+                    </a:prstGeom>
+                  </pic:spPr>
+                </pic:pic>
+              </a:graphicData>
+            </a:graphic>
+          </wp:inline>
+        </w:drawing>
+      </w:r>
+    </w:p>
+    <w:p>
+      <w:pPr>
+        <w:ind w:left="1068"/>
+        <w:rPr>
+          <w:rFonts w:ascii="WPP" w:hAnsi="WPP"/>
+        </w:rPr>
+      </w:pPr>
+      <w:r>
+        <w:rPr>
+          <w:rFonts w:ascii="WPP" w:hAnsi="WPP"/>
+        </w:rPr>
+        <w:t>Impacto Predictivo.</w:t>
+      </w:r>
+    </w:p>
+    <w:p>
+      <w:pPr>
+        <w:ind w:left="1068"/>
+        <w:rPr>
+          <w:rFonts w:ascii="WPP" w:hAnsi="WPP"/>
+        </w:rPr>
+      </w:pPr>
+      <w:r>
+        <w:rPr>
+          <w:rFonts w:ascii="WPP" w:hAnsi="WPP"/>
+        </w:rPr>
+        <w:t>Muestra el incremental al que llegará la marca dado el monto de inversión de la marca</w:t>
+      </w:r>
+    </w:p>
+    <w:p>
+      <w:pPr>
+        <w:ind w:left="1068"/>
+        <w:jc w:val="center"/>
+        <w:rPr>
+          <w:rFonts w:ascii="WPP" w:hAnsi="WPP"/>
+        </w:rPr>
+      </w:pPr>
+      <w:r>
+        <w:rPr>
+          <w:rFonts w:ascii="WPP" w:hAnsi="WPP"/>
+        </w:rPr>
+        <w:drawing>
+          <wp:inline distT="0" distB="0" distL="0" distR="0" wp14:anchorId="6C4278E3" wp14:editId="4D24A00A">
+            <wp:extent cx="4333875" cy="1783469"/>
+            <wp:effectExtent l="0" t="0" r="0" b="7620"/>
+            <wp:docPr id="1030006329" name="Imagen 1"/>
+            <wp:cNvGraphicFramePr>
+              <a:graphicFrameLocks xmlns:a="http://schemas.openxmlformats.org/drawingml/2006/main" noChangeAspect="1"/>
+            </wp:cNvGraphicFramePr>
+            <a:graphic xmlns:a="http://schemas.openxmlformats.org/drawingml/2006/main">
+              <a:graphicData uri="http://schemas.openxmlformats.org/drawingml/2006/picture">
+                <pic:pic xmlns:pic="http://schemas.openxmlformats.org/drawingml/2006/picture">
+                  <pic:nvPicPr>
+                    <pic:cNvPr id="1030006329" name=""/>
+                    <pic:cNvPicPr/>
+                  </pic:nvPicPr>
+                  <pic:blipFill>
+                    <a:blip r:embed="rId15"/>
+                    <a:stretch>
+                      <a:fillRect/>
+                    </a:stretch>
+                  </pic:blipFill>
+                  <pic:spPr>
+                    <a:xfrm>
+                      <a:off x="0" y="0"/>
+                      <a:ext cx="4339650" cy="1785846"/>
+                    </a:xfrm>
+                    <a:prstGeom prst="rect">
+                      <a:avLst/>
+                    </a:prstGeom>
+                  </pic:spPr>
+                </pic:pic>
+              </a:graphicData>
+            </a:graphic>
+          </wp:inline>
+        </w:drawing>
+      </w:r>
+    </w:p>
+    <w:p>
+      <w:pPr>
+        <w:ind w:left="1068"/>
+        <w:rPr>
+          <w:rFonts w:ascii="WPP" w:hAnsi="WPP"/>
+        </w:rPr>
+      </w:pPr>
+      <w:r>
+        <w:rPr>
+          <w:rFonts w:ascii="WPP" w:hAnsi="WPP"/>
+        </w:rPr>
+        <w:t>Validación de Datas Cargados</w:t>
+      </w:r>
+    </w:p>
+    <w:p>
+      <w:pPr>
+        <w:ind w:left="1068"/>
+        <w:rPr>
+          <w:rFonts w:ascii="WPP" w:hAnsi="WPP"/>
+        </w:rPr>
+      </w:pPr>
+      <w:r>
+        <w:rPr>
+          <w:rFonts w:ascii="WPP" w:hAnsi="WPP"/>
+        </w:rPr>
+        <w:t xml:space="preserve">Pestaña para validar que el Data Set se cargó correctamente. </w:t>
+      </w:r>
+    </w:p>
+    <w:p>
+      <w:pPr>
+        <w:ind w:left="360" w:firstLine="348"/>
+        <w:rPr>
+          <w:rFonts w:ascii="WPP" w:hAnsi="WPP"/>
+        </w:rPr>
+      </w:pPr>
+      <w:r>
+        <w:rPr>
+          <w:rFonts w:ascii="WPP" w:hAnsi="WPP"/>
+        </w:rPr>
+        <w:t xml:space="preserve"> </w:t>
+      </w:r>
+    </w:p>
     <w:p/>
     <w:sectPr>
       <w:pgSz w:w="12240" w:h="15840"/>
@@ -11,6 +2142,448 @@
     </w:sectPr>
   </w:body>
 </w:document>
+</file>
+
+<file path=word/numbering.xml><?xml version="1.0" encoding="utf-8"?>
+<w:numbering xmlns:wpc="http://schemas.microsoft.com/office/word/2010/wordprocessingCanvas" xmlns:cx="http://schemas.microsoft.com/office/drawing/2014/chartex" xmlns:cx1="http://schemas.microsoft.com/office/drawing/2015/9/8/chartex" xmlns:cx2="http://schemas.microsoft.com/office/drawing/2015/10/21/chartex" xmlns:cx3="http://schemas.microsoft.com/office/drawing/2016/5/9/chartex" xmlns:cx4="http://schemas.microsoft.com/office/drawing/2016/5/10/chartex" xmlns:cx5="http://schemas.microsoft.com/office/drawing/2016/5/11/chartex" xmlns:cx6="http://schemas.microsoft.com/office/drawing/2016/5/12/chartex" xmlns:cx7="http://schemas.microsoft.com/office/drawing/2016/5/13/chartex" xmlns:cx8="http://schemas.microsoft.com/office/drawing/2016/5/14/chartex" xmlns:mc="http://schemas.openxmlformats.org/markup-compatibility/2006" xmlns:aink="http://schemas.microsoft.com/office/drawing/2016/ink" xmlns:am3d="http://schemas.microsoft.com/office/drawing/2017/model3d" xmlns:o="urn:schemas-microsoft-com:office:office" xmlns:oel="http://schemas.microsoft.com/office/2019/extlst" xmlns:r="http://schemas.openxmlformats.org/officeDocument/2006/relationships" xmlns:m="http://schemas.openxmlformats.org/officeDocument/2006/math" xmlns:v="urn:schemas-microsoft-com:vml" xmlns:wp14="http://schemas.microsoft.com/office/word/2010/wordprocessingDrawing" xmlns:wp="http://schemas.openxmlformats.org/drawingml/2006/wordprocessingDrawing" xmlns:w10="urn:schemas-microsoft-com:office:word" xmlns:w="http://schemas.openxmlformats.org/wordprocessingml/2006/main" xmlns:w14="http://schemas.microsoft.com/office/word/2010/wordml" xmlns:w15="http://schemas.microsoft.com/office/word/2012/wordml" xmlns:w16cex="http://schemas.microsoft.com/office/word/2018/wordml/cex" xmlns:w16cid="http://schemas.microsoft.com/office/word/2016/wordml/cid" xmlns:w16="http://schemas.microsoft.com/office/word/2018/wordml" xmlns:w16du="http://schemas.microsoft.com/office/word/2023/wordml/word16du" xmlns:w16sdtdh="http://schemas.microsoft.com/office/word/2020/wordml/sdtdatahash" xmlns:w16sdtfl="http://schemas.microsoft.com/office/word/2024/wordml/sdtformatlock" xmlns:w16se="http://schemas.microsoft.com/office/word/2015/wordml/symex" xmlns:wpg="http://schemas.microsoft.com/office/word/2010/wordprocessingGroup" xmlns:wpi="http://schemas.microsoft.com/office/word/2010/wordprocessingInk" xmlns:wne="http://schemas.microsoft.com/office/word/2006/wordml" xmlns:wps="http://schemas.microsoft.com/office/word/2010/wordprocessingShape" mc:Ignorable="w14 w15 w16se w16cid w16 w16cex w16sdtdh w16sdtfl w16du wp14">
+  <w:abstractNum w:abstractNumId="0" w15:restartNumberingAfterBreak="0">
+    <w:nsid w:val="380F677F"/>
+    <w:multiLevelType w:val="hybridMultilevel"/>
+    <w:tmpl w:val="87A40DF0"/>
+    <w:lvl w:ilvl="0" w:tplc="080A000F">
+      <w:start w:val="1"/>
+      <w:numFmt w:val="decimal"/>
+      <w:lvlText w:val="%1."/>
+      <w:lvlJc w:val="left"/>
+      <w:pPr>
+        <w:ind w:left="720" w:hanging="360"/>
+      </w:pPr>
+    </w:lvl>
+    <w:lvl w:ilvl="1" w:tplc="080A0019" w:tentative="1">
+      <w:start w:val="1"/>
+      <w:numFmt w:val="lowerLetter"/>
+      <w:lvlText w:val="%2."/>
+      <w:lvlJc w:val="left"/>
+      <w:pPr>
+        <w:ind w:left="1440" w:hanging="360"/>
+      </w:pPr>
+    </w:lvl>
+    <w:lvl w:ilvl="2" w:tplc="080A001B" w:tentative="1">
+      <w:start w:val="1"/>
+      <w:numFmt w:val="lowerRoman"/>
+      <w:lvlText w:val="%3."/>
+      <w:lvlJc w:val="right"/>
+      <w:pPr>
+        <w:ind w:left="2160" w:hanging="180"/>
+      </w:pPr>
+    </w:lvl>
+    <w:lvl w:ilvl="3" w:tplc="080A000F" w:tentative="1">
+      <w:start w:val="1"/>
+      <w:numFmt w:val="decimal"/>
+      <w:lvlText w:val="%4."/>
+      <w:lvlJc w:val="left"/>
+      <w:pPr>
+        <w:ind w:left="2880" w:hanging="360"/>
+      </w:pPr>
+    </w:lvl>
+    <w:lvl w:ilvl="4" w:tplc="080A0019" w:tentative="1">
+      <w:start w:val="1"/>
+      <w:numFmt w:val="lowerLetter"/>
+      <w:lvlText w:val="%5."/>
+      <w:lvlJc w:val="left"/>
+      <w:pPr>
+        <w:ind w:left="3600" w:hanging="360"/>
+      </w:pPr>
+    </w:lvl>
+    <w:lvl w:ilvl="5" w:tplc="080A001B" w:tentative="1">
+      <w:start w:val="1"/>
+      <w:numFmt w:val="lowerRoman"/>
+      <w:lvlText w:val="%6."/>
+      <w:lvlJc w:val="right"/>
+      <w:pPr>
+        <w:ind w:left="4320" w:hanging="180"/>
+      </w:pPr>
+    </w:lvl>
+    <w:lvl w:ilvl="6" w:tplc="080A000F" w:tentative="1">
+      <w:start w:val="1"/>
+      <w:numFmt w:val="decimal"/>
+      <w:lvlText w:val="%7."/>
+      <w:lvlJc w:val="left"/>
+      <w:pPr>
+        <w:ind w:left="5040" w:hanging="360"/>
+      </w:pPr>
+    </w:lvl>
+    <w:lvl w:ilvl="7" w:tplc="080A0019" w:tentative="1">
+      <w:start w:val="1"/>
+      <w:numFmt w:val="lowerLetter"/>
+      <w:lvlText w:val="%8."/>
+      <w:lvlJc w:val="left"/>
+      <w:pPr>
+        <w:ind w:left="5760" w:hanging="360"/>
+      </w:pPr>
+    </w:lvl>
+    <w:lvl w:ilvl="8" w:tplc="080A001B" w:tentative="1">
+      <w:start w:val="1"/>
+      <w:numFmt w:val="lowerRoman"/>
+      <w:lvlText w:val="%9."/>
+      <w:lvlJc w:val="right"/>
+      <w:pPr>
+        <w:ind w:left="6480" w:hanging="180"/>
+      </w:pPr>
+    </w:lvl>
+  </w:abstractNum>
+  <w:abstractNum w:abstractNumId="1" w15:restartNumberingAfterBreak="0">
+    <w:nsid w:val="4D06224E"/>
+    <w:multiLevelType w:val="hybridMultilevel"/>
+    <w:tmpl w:val="7ADCE360"/>
+    <w:lvl w:ilvl="0" w:tplc="080A0001">
+      <w:start w:val="1"/>
+      <w:numFmt w:val="bullet"/>
+      <w:lvlText w:val=""/>
+      <w:lvlJc w:val="left"/>
+      <w:pPr>
+        <w:ind w:left="720" w:hanging="360"/>
+      </w:pPr>
+      <w:rPr>
+        <w:rFonts w:ascii="Symbol" w:hAnsi="Symbol" w:hint="default"/>
+      </w:rPr>
+    </w:lvl>
+    <w:lvl w:ilvl="1" w:tplc="080A0003" w:tentative="1">
+      <w:start w:val="1"/>
+      <w:numFmt w:val="bullet"/>
+      <w:lvlText w:val="o"/>
+      <w:lvlJc w:val="left"/>
+      <w:pPr>
+        <w:ind w:left="1440" w:hanging="360"/>
+      </w:pPr>
+      <w:rPr>
+        <w:rFonts w:ascii="Courier New" w:hAnsi="Courier New" w:cs="Courier New" w:hint="default"/>
+      </w:rPr>
+    </w:lvl>
+    <w:lvl w:ilvl="2" w:tplc="080A0005" w:tentative="1">
+      <w:start w:val="1"/>
+      <w:numFmt w:val="bullet"/>
+      <w:lvlText w:val=""/>
+      <w:lvlJc w:val="left"/>
+      <w:pPr>
+        <w:ind w:left="2160" w:hanging="360"/>
+      </w:pPr>
+      <w:rPr>
+        <w:rFonts w:ascii="Wingdings" w:hAnsi="Wingdings" w:hint="default"/>
+      </w:rPr>
+    </w:lvl>
+    <w:lvl w:ilvl="3" w:tplc="080A0001" w:tentative="1">
+      <w:start w:val="1"/>
+      <w:numFmt w:val="bullet"/>
+      <w:lvlText w:val=""/>
+      <w:lvlJc w:val="left"/>
+      <w:pPr>
+        <w:ind w:left="2880" w:hanging="360"/>
+      </w:pPr>
+      <w:rPr>
+        <w:rFonts w:ascii="Symbol" w:hAnsi="Symbol" w:hint="default"/>
+      </w:rPr>
+    </w:lvl>
+    <w:lvl w:ilvl="4" w:tplc="080A0003" w:tentative="1">
+      <w:start w:val="1"/>
+      <w:numFmt w:val="bullet"/>
+      <w:lvlText w:val="o"/>
+      <w:lvlJc w:val="left"/>
+      <w:pPr>
+        <w:ind w:left="3600" w:hanging="360"/>
+      </w:pPr>
+      <w:rPr>
+        <w:rFonts w:ascii="Courier New" w:hAnsi="Courier New" w:cs="Courier New" w:hint="default"/>
+      </w:rPr>
+    </w:lvl>
+    <w:lvl w:ilvl="5" w:tplc="080A0005" w:tentative="1">
+      <w:start w:val="1"/>
+      <w:numFmt w:val="bullet"/>
+      <w:lvlText w:val=""/>
+      <w:lvlJc w:val="left"/>
+      <w:pPr>
+        <w:ind w:left="4320" w:hanging="360"/>
+      </w:pPr>
+      <w:rPr>
+        <w:rFonts w:ascii="Wingdings" w:hAnsi="Wingdings" w:hint="default"/>
+      </w:rPr>
+    </w:lvl>
+    <w:lvl w:ilvl="6" w:tplc="080A0001" w:tentative="1">
+      <w:start w:val="1"/>
+      <w:numFmt w:val="bullet"/>
+      <w:lvlText w:val=""/>
+      <w:lvlJc w:val="left"/>
+      <w:pPr>
+        <w:ind w:left="5040" w:hanging="360"/>
+      </w:pPr>
+      <w:rPr>
+        <w:rFonts w:ascii="Symbol" w:hAnsi="Symbol" w:hint="default"/>
+      </w:rPr>
+    </w:lvl>
+    <w:lvl w:ilvl="7" w:tplc="080A0003" w:tentative="1">
+      <w:start w:val="1"/>
+      <w:numFmt w:val="bullet"/>
+      <w:lvlText w:val="o"/>
+      <w:lvlJc w:val="left"/>
+      <w:pPr>
+        <w:ind w:left="5760" w:hanging="360"/>
+      </w:pPr>
+      <w:rPr>
+        <w:rFonts w:ascii="Courier New" w:hAnsi="Courier New" w:cs="Courier New" w:hint="default"/>
+      </w:rPr>
+    </w:lvl>
+    <w:lvl w:ilvl="8" w:tplc="080A0005" w:tentative="1">
+      <w:start w:val="1"/>
+      <w:numFmt w:val="bullet"/>
+      <w:lvlText w:val=""/>
+      <w:lvlJc w:val="left"/>
+      <w:pPr>
+        <w:ind w:left="6480" w:hanging="360"/>
+      </w:pPr>
+      <w:rPr>
+        <w:rFonts w:ascii="Wingdings" w:hAnsi="Wingdings" w:hint="default"/>
+      </w:rPr>
+    </w:lvl>
+  </w:abstractNum>
+  <w:abstractNum w:abstractNumId="2" w15:restartNumberingAfterBreak="0">
+    <w:nsid w:val="5BEA67C7"/>
+    <w:multiLevelType w:val="hybridMultilevel"/>
+    <w:tmpl w:val="0816799E"/>
+    <w:lvl w:ilvl="0" w:tplc="080A0001">
+      <w:start w:val="1"/>
+      <w:numFmt w:val="bullet"/>
+      <w:lvlText w:val=""/>
+      <w:lvlJc w:val="left"/>
+      <w:pPr>
+        <w:ind w:left="720" w:hanging="360"/>
+      </w:pPr>
+      <w:rPr>
+        <w:rFonts w:ascii="Symbol" w:hAnsi="Symbol" w:hint="default"/>
+      </w:rPr>
+    </w:lvl>
+    <w:lvl w:ilvl="1" w:tplc="080A0003" w:tentative="1">
+      <w:start w:val="1"/>
+      <w:numFmt w:val="bullet"/>
+      <w:lvlText w:val="o"/>
+      <w:lvlJc w:val="left"/>
+      <w:pPr>
+        <w:ind w:left="1440" w:hanging="360"/>
+      </w:pPr>
+      <w:rPr>
+        <w:rFonts w:ascii="Courier New" w:hAnsi="Courier New" w:cs="Courier New" w:hint="default"/>
+      </w:rPr>
+    </w:lvl>
+    <w:lvl w:ilvl="2" w:tplc="080A0005" w:tentative="1">
+      <w:start w:val="1"/>
+      <w:numFmt w:val="bullet"/>
+      <w:lvlText w:val=""/>
+      <w:lvlJc w:val="left"/>
+      <w:pPr>
+        <w:ind w:left="2160" w:hanging="360"/>
+      </w:pPr>
+      <w:rPr>
+        <w:rFonts w:ascii="Wingdings" w:hAnsi="Wingdings" w:hint="default"/>
+      </w:rPr>
+    </w:lvl>
+    <w:lvl w:ilvl="3" w:tplc="080A0001" w:tentative="1">
+      <w:start w:val="1"/>
+      <w:numFmt w:val="bullet"/>
+      <w:lvlText w:val=""/>
+      <w:lvlJc w:val="left"/>
+      <w:pPr>
+        <w:ind w:left="2880" w:hanging="360"/>
+      </w:pPr>
+      <w:rPr>
+        <w:rFonts w:ascii="Symbol" w:hAnsi="Symbol" w:hint="default"/>
+      </w:rPr>
+    </w:lvl>
+    <w:lvl w:ilvl="4" w:tplc="080A0003" w:tentative="1">
+      <w:start w:val="1"/>
+      <w:numFmt w:val="bullet"/>
+      <w:lvlText w:val="o"/>
+      <w:lvlJc w:val="left"/>
+      <w:pPr>
+        <w:ind w:left="3600" w:hanging="360"/>
+      </w:pPr>
+      <w:rPr>
+        <w:rFonts w:ascii="Courier New" w:hAnsi="Courier New" w:cs="Courier New" w:hint="default"/>
+      </w:rPr>
+    </w:lvl>
+    <w:lvl w:ilvl="5" w:tplc="080A0005" w:tentative="1">
+      <w:start w:val="1"/>
+      <w:numFmt w:val="bullet"/>
+      <w:lvlText w:val=""/>
+      <w:lvlJc w:val="left"/>
+      <w:pPr>
+        <w:ind w:left="4320" w:hanging="360"/>
+      </w:pPr>
+      <w:rPr>
+        <w:rFonts w:ascii="Wingdings" w:hAnsi="Wingdings" w:hint="default"/>
+      </w:rPr>
+    </w:lvl>
+    <w:lvl w:ilvl="6" w:tplc="080A0001" w:tentative="1">
+      <w:start w:val="1"/>
+      <w:numFmt w:val="bullet"/>
+      <w:lvlText w:val=""/>
+      <w:lvlJc w:val="left"/>
+      <w:pPr>
+        <w:ind w:left="5040" w:hanging="360"/>
+      </w:pPr>
+      <w:rPr>
+        <w:rFonts w:ascii="Symbol" w:hAnsi="Symbol" w:hint="default"/>
+      </w:rPr>
+    </w:lvl>
+    <w:lvl w:ilvl="7" w:tplc="080A0003" w:tentative="1">
+      <w:start w:val="1"/>
+      <w:numFmt w:val="bullet"/>
+      <w:lvlText w:val="o"/>
+      <w:lvlJc w:val="left"/>
+      <w:pPr>
+        <w:ind w:left="5760" w:hanging="360"/>
+      </w:pPr>
+      <w:rPr>
+        <w:rFonts w:ascii="Courier New" w:hAnsi="Courier New" w:cs="Courier New" w:hint="default"/>
+      </w:rPr>
+    </w:lvl>
+    <w:lvl w:ilvl="8" w:tplc="080A0005" w:tentative="1">
+      <w:start w:val="1"/>
+      <w:numFmt w:val="bullet"/>
+      <w:lvlText w:val=""/>
+      <w:lvlJc w:val="left"/>
+      <w:pPr>
+        <w:ind w:left="6480" w:hanging="360"/>
+      </w:pPr>
+      <w:rPr>
+        <w:rFonts w:ascii="Wingdings" w:hAnsi="Wingdings" w:hint="default"/>
+      </w:rPr>
+    </w:lvl>
+  </w:abstractNum>
+  <w:abstractNum w:abstractNumId="3" w15:restartNumberingAfterBreak="0">
+    <w:nsid w:val="7553449F"/>
+    <w:multiLevelType w:val="hybridMultilevel"/>
+    <w:tmpl w:val="9D4E5FD4"/>
+    <w:lvl w:ilvl="0" w:tplc="080A0001">
+      <w:start w:val="1"/>
+      <w:numFmt w:val="bullet"/>
+      <w:lvlText w:val=""/>
+      <w:lvlJc w:val="left"/>
+      <w:pPr>
+        <w:ind w:left="1428" w:hanging="360"/>
+      </w:pPr>
+      <w:rPr>
+        <w:rFonts w:ascii="Symbol" w:hAnsi="Symbol" w:hint="default"/>
+      </w:rPr>
+    </w:lvl>
+    <w:lvl w:ilvl="1" w:tplc="080A0003" w:tentative="1">
+      <w:start w:val="1"/>
+      <w:numFmt w:val="bullet"/>
+      <w:lvlText w:val="o"/>
+      <w:lvlJc w:val="left"/>
+      <w:pPr>
+        <w:ind w:left="2148" w:hanging="360"/>
+      </w:pPr>
+      <w:rPr>
+        <w:rFonts w:ascii="Courier New" w:hAnsi="Courier New" w:cs="Courier New" w:hint="default"/>
+      </w:rPr>
+    </w:lvl>
+    <w:lvl w:ilvl="2" w:tplc="080A0005" w:tentative="1">
+      <w:start w:val="1"/>
+      <w:numFmt w:val="bullet"/>
+      <w:lvlText w:val=""/>
+      <w:lvlJc w:val="left"/>
+      <w:pPr>
+        <w:ind w:left="2868" w:hanging="360"/>
+      </w:pPr>
+      <w:rPr>
+        <w:rFonts w:ascii="Wingdings" w:hAnsi="Wingdings" w:hint="default"/>
+      </w:rPr>
+    </w:lvl>
+    <w:lvl w:ilvl="3" w:tplc="080A0001" w:tentative="1">
+      <w:start w:val="1"/>
+      <w:numFmt w:val="bullet"/>
+      <w:lvlText w:val=""/>
+      <w:lvlJc w:val="left"/>
+      <w:pPr>
+        <w:ind w:left="3588" w:hanging="360"/>
+      </w:pPr>
+      <w:rPr>
+        <w:rFonts w:ascii="Symbol" w:hAnsi="Symbol" w:hint="default"/>
+      </w:rPr>
+    </w:lvl>
+    <w:lvl w:ilvl="4" w:tplc="080A0003" w:tentative="1">
+      <w:start w:val="1"/>
+      <w:numFmt w:val="bullet"/>
+      <w:lvlText w:val="o"/>
+      <w:lvlJc w:val="left"/>
+      <w:pPr>
+        <w:ind w:left="4308" w:hanging="360"/>
+      </w:pPr>
+      <w:rPr>
+        <w:rFonts w:ascii="Courier New" w:hAnsi="Courier New" w:cs="Courier New" w:hint="default"/>
+      </w:rPr>
+    </w:lvl>
+    <w:lvl w:ilvl="5" w:tplc="080A0005" w:tentative="1">
+      <w:start w:val="1"/>
+      <w:numFmt w:val="bullet"/>
+      <w:lvlText w:val=""/>
+      <w:lvlJc w:val="left"/>
+      <w:pPr>
+        <w:ind w:left="5028" w:hanging="360"/>
+      </w:pPr>
+      <w:rPr>
+        <w:rFonts w:ascii="Wingdings" w:hAnsi="Wingdings" w:hint="default"/>
+      </w:rPr>
+    </w:lvl>
+    <w:lvl w:ilvl="6" w:tplc="080A0001" w:tentative="1">
+      <w:start w:val="1"/>
+      <w:numFmt w:val="bullet"/>
+      <w:lvlText w:val=""/>
+      <w:lvlJc w:val="left"/>
+      <w:pPr>
+        <w:ind w:left="5748" w:hanging="360"/>
+      </w:pPr>
+      <w:rPr>
+        <w:rFonts w:ascii="Symbol" w:hAnsi="Symbol" w:hint="default"/>
+      </w:rPr>
+    </w:lvl>
+    <w:lvl w:ilvl="7" w:tplc="080A0003" w:tentative="1">
+      <w:start w:val="1"/>
+      <w:numFmt w:val="bullet"/>
+      <w:lvlText w:val="o"/>
+      <w:lvlJc w:val="left"/>
+      <w:pPr>
+        <w:ind w:left="6468" w:hanging="360"/>
+      </w:pPr>
+      <w:rPr>
+        <w:rFonts w:ascii="Courier New" w:hAnsi="Courier New" w:cs="Courier New" w:hint="default"/>
+      </w:rPr>
+    </w:lvl>
+    <w:lvl w:ilvl="8" w:tplc="080A0005" w:tentative="1">
+      <w:start w:val="1"/>
+      <w:numFmt w:val="bullet"/>
+      <w:lvlText w:val=""/>
+      <w:lvlJc w:val="left"/>
+      <w:pPr>
+        <w:ind w:left="7188" w:hanging="360"/>
+      </w:pPr>
+      <w:rPr>
+        <w:rFonts w:ascii="Wingdings" w:hAnsi="Wingdings" w:hint="default"/>
+      </w:rPr>
+    </w:lvl>
+  </w:abstractNum>
+  <w:num w:numId="1" w16cid:durableId="77294881">
+    <w:abstractNumId w:val="1"/>
+  </w:num>
+  <w:num w:numId="2" w16cid:durableId="945693278">
+    <w:abstractNumId w:val="0"/>
+  </w:num>
+  <w:num w:numId="3" w16cid:durableId="642126494">
+    <w:abstractNumId w:val="2"/>
+  </w:num>
+  <w:num w:numId="4" w16cid:durableId="160588048">
+    <w:abstractNumId w:val="3"/>
+  </w:num>
+</w:numbering>
 </file>
 
 <file path=word/styles.xml><?xml version="1.0" encoding="utf-8"?>
@@ -413,6 +2986,7 @@
   <w:style w:type="paragraph" w:default="1" w:styleId="Normal">
     <w:name w:val="Normal"/>
     <w:qFormat/>
+    <w:rsid w:val="003A7EB3"/>
   </w:style>
   <w:style w:type="paragraph" w:styleId="Ttulo1">
     <w:name w:val="heading 1"/>
@@ -930,6 +3504,48 @@
       <w:spacing w:val="5"/>
     </w:rPr>
   </w:style>
+  <w:style w:type="table" w:styleId="Tablaconcuadrcula">
+    <w:name w:val="Table Grid"/>
+    <w:basedOn w:val="Tablanormal"/>
+    <w:uiPriority w:val="39"/>
+    <w:rsid w:val="003A7EB3"/>
+    <w:pPr>
+      <w:spacing w:after="0" w:line="240" w:lineRule="auto"/>
+    </w:pPr>
+    <w:tblPr>
+      <w:tblBorders>
+        <w:top w:val="single" w:sz="4" w:space="0" w:color="auto"/>
+        <w:left w:val="single" w:sz="4" w:space="0" w:color="auto"/>
+        <w:bottom w:val="single" w:sz="4" w:space="0" w:color="auto"/>
+        <w:right w:val="single" w:sz="4" w:space="0" w:color="auto"/>
+        <w:insideH w:val="single" w:sz="4" w:space="0" w:color="auto"/>
+        <w:insideV w:val="single" w:sz="4" w:space="0" w:color="auto"/>
+      </w:tblBorders>
+    </w:tblPr>
+  </w:style>
+  <w:style w:type="character" w:styleId="Hipervnculo">
+    <w:name w:val="Hyperlink"/>
+    <w:basedOn w:val="Fuentedeprrafopredeter"/>
+    <w:uiPriority w:val="99"/>
+    <w:unhideWhenUsed/>
+    <w:rsid w:val="003A7EB3"/>
+    <w:rPr>
+      <w:color w:val="467886" w:themeColor="hyperlink"/>
+      <w:u w:val="single"/>
+    </w:rPr>
+  </w:style>
+  <w:style w:type="character" w:styleId="Hipervnculovisitado">
+    <w:name w:val="FollowedHyperlink"/>
+    <w:basedOn w:val="Fuentedeprrafopredeter"/>
+    <w:uiPriority w:val="99"/>
+    <w:semiHidden/>
+    <w:unhideWhenUsed/>
+    <w:rsid w:val="003A7EB3"/>
+    <w:rPr>
+      <w:color w:val="96607D" w:themeColor="followedHyperlink"/>
+      <w:u w:val="single"/>
+    </w:rPr>
+  </w:style>
 </w:styles>
 </file>
 

</xml_diff>